<commit_message>
Document unblocking the macro security-risk banner in the staff manual
Step 2 now distinguishes the yellow "enable content" bar from the red
Mark-of-the-Web block and gives the Properties > Unblock steps.

Co-Authored-By: Claude Fable 5.1 <noreply@anthropic.com>
Claude-Session: https://claude.ai/code/session_011jJw2pCa25gsUc64u4BE6s
</commit_message>
<xml_diff>
--- a/excel-reception/事務員向け_受付ファイル作成手順書.docx
+++ b/excel-reception/事務員向け_受付ファイル作成手順書.docx
@@ -1025,6 +1025,366 @@
     </w:p>
     <w:p>
       <w:pPr>
+        <w:spacing w:after="100" w:line="300"/>
+      </w:pPr>
+      <w:r>
+        <w:rPr>
+          <w:rFonts w:ascii="Yu Gothic" w:cs="Yu Gothic" w:eastAsia="Yu Gothic" w:hAnsi="Yu Gothic"/>
+          <w:sz w:val="21"/>
+          <w:szCs w:val="21"/>
+        </w:rPr>
+        <w:t xml:space="preserve">このファイルはボタン（マクロ）で動くため、開いたときに表示される帯の種類によって対応が変わります。</w:t>
+      </w:r>
+    </w:p>
+    <w:tbl>
+      <w:tblPr>
+        <w:tblW w:type="dxa" w:w="9638"/>
+        <w:tblBorders>
+          <w:top w:val="single" w:color="auto" w:sz="4"/>
+          <w:left w:val="single" w:color="auto" w:sz="4"/>
+          <w:bottom w:val="single" w:color="auto" w:sz="4"/>
+          <w:right w:val="single" w:color="auto" w:sz="4"/>
+          <w:insideH w:val="single" w:color="auto" w:sz="4"/>
+          <w:insideV w:val="single" w:color="auto" w:sz="4"/>
+        </w:tblBorders>
+      </w:tblPr>
+      <w:tblGrid>
+        <w:gridCol w:w="4337"/>
+        <w:gridCol w:w="5301"/>
+      </w:tblGrid>
+      <w:tr>
+        <w:trPr>
+          <w:tblHeader/>
+        </w:trPr>
+        <w:tc>
+          <w:tcPr>
+            <w:tcW w:type="dxa" w:w="4337"/>
+            <w:tcBorders>
+              <w:top w:val="single" w:color="B8CBD4" w:sz="4"/>
+              <w:left w:val="single" w:color="B8CBD4" w:sz="4"/>
+              <w:bottom w:val="single" w:color="B8CBD4" w:sz="4"/>
+              <w:right w:val="single" w:color="B8CBD4" w:sz="4"/>
+            </w:tcBorders>
+            <w:shd w:fill="0F2847" w:color="auto" w:val="clear"/>
+            <w:tcMar>
+              <w:top w:type="dxa" w:w="60"/>
+              <w:left w:type="dxa" w:w="100"/>
+              <w:bottom w:type="dxa" w:w="60"/>
+              <w:right w:type="dxa" w:w="100"/>
+            </w:tcMar>
+          </w:tcPr>
+          <w:p>
+            <w:pPr>
+              <w:spacing w:after="0" w:line="260"/>
+            </w:pPr>
+            <w:r>
+              <w:rPr>
+                <w:rFonts w:ascii="Yu Gothic" w:cs="Yu Gothic" w:eastAsia="Yu Gothic" w:hAnsi="Yu Gothic"/>
+                <w:b/>
+                <w:bCs/>
+                <w:color w:val="FFFFFF"/>
+                <w:sz w:val="19"/>
+                <w:szCs w:val="19"/>
+              </w:rPr>
+              <w:t xml:space="preserve">開いたときの表示</w:t>
+            </w:r>
+          </w:p>
+        </w:tc>
+        <w:tc>
+          <w:tcPr>
+            <w:tcW w:type="dxa" w:w="5301"/>
+            <w:tcBorders>
+              <w:top w:val="single" w:color="B8CBD4" w:sz="4"/>
+              <w:left w:val="single" w:color="B8CBD4" w:sz="4"/>
+              <w:bottom w:val="single" w:color="B8CBD4" w:sz="4"/>
+              <w:right w:val="single" w:color="B8CBD4" w:sz="4"/>
+            </w:tcBorders>
+            <w:shd w:fill="0F2847" w:color="auto" w:val="clear"/>
+            <w:tcMar>
+              <w:top w:type="dxa" w:w="60"/>
+              <w:left w:type="dxa" w:w="100"/>
+              <w:bottom w:type="dxa" w:w="60"/>
+              <w:right w:type="dxa" w:w="100"/>
+            </w:tcMar>
+          </w:tcPr>
+          <w:p>
+            <w:pPr>
+              <w:spacing w:after="0" w:line="260"/>
+            </w:pPr>
+            <w:r>
+              <w:rPr>
+                <w:rFonts w:ascii="Yu Gothic" w:cs="Yu Gothic" w:eastAsia="Yu Gothic" w:hAnsi="Yu Gothic"/>
+                <w:b/>
+                <w:bCs/>
+                <w:color w:val="FFFFFF"/>
+                <w:sz w:val="19"/>
+                <w:szCs w:val="19"/>
+              </w:rPr>
+              <w:t xml:space="preserve">対応</w:t>
+            </w:r>
+          </w:p>
+        </w:tc>
+      </w:tr>
+      <w:tr>
+        <w:trPr>
+          <w:cantSplit/>
+        </w:trPr>
+        <w:tc>
+          <w:tcPr>
+            <w:tcW w:type="dxa" w:w="4337"/>
+            <w:tcBorders>
+              <w:top w:val="single" w:color="B8CBD4" w:sz="4"/>
+              <w:left w:val="single" w:color="B8CBD4" w:sz="4"/>
+              <w:bottom w:val="single" w:color="B8CBD4" w:sz="4"/>
+              <w:right w:val="single" w:color="B8CBD4" w:sz="4"/>
+            </w:tcBorders>
+            <w:shd w:fill="FFFFFF" w:color="auto" w:val="clear"/>
+            <w:tcMar>
+              <w:top w:type="dxa" w:w="60"/>
+              <w:left w:type="dxa" w:w="100"/>
+              <w:bottom w:type="dxa" w:w="60"/>
+              <w:right w:type="dxa" w:w="100"/>
+            </w:tcMar>
+          </w:tcPr>
+          <w:p>
+            <w:pPr>
+              <w:spacing w:after="0" w:line="260"/>
+            </w:pPr>
+            <w:r>
+              <w:rPr>
+                <w:rFonts w:ascii="Yu Gothic" w:cs="Yu Gothic" w:eastAsia="Yu Gothic" w:hAnsi="Yu Gothic"/>
+                <w:b w:val="false"/>
+                <w:bCs w:val="false"/>
+                <w:color w:val="000000"/>
+                <w:sz w:val="19"/>
+                <w:szCs w:val="19"/>
+              </w:rPr>
+              <w:t xml:space="preserve">黄色い帯「セキュリティの警告　マクロが無効にされました」</w:t>
+            </w:r>
+          </w:p>
+        </w:tc>
+        <w:tc>
+          <w:tcPr>
+            <w:tcW w:type="dxa" w:w="5301"/>
+            <w:tcBorders>
+              <w:top w:val="single" w:color="B8CBD4" w:sz="4"/>
+              <w:left w:val="single" w:color="B8CBD4" w:sz="4"/>
+              <w:bottom w:val="single" w:color="B8CBD4" w:sz="4"/>
+              <w:right w:val="single" w:color="B8CBD4" w:sz="4"/>
+            </w:tcBorders>
+            <w:shd w:fill="FFFFFF" w:color="auto" w:val="clear"/>
+            <w:tcMar>
+              <w:top w:type="dxa" w:w="60"/>
+              <w:left w:type="dxa" w:w="100"/>
+              <w:bottom w:type="dxa" w:w="60"/>
+              <w:right w:type="dxa" w:w="100"/>
+            </w:tcMar>
+          </w:tcPr>
+          <w:p>
+            <w:pPr>
+              <w:spacing w:after="0" w:line="260"/>
+            </w:pPr>
+            <w:r>
+              <w:rPr>
+                <w:rFonts w:ascii="Yu Gothic" w:cs="Yu Gothic" w:eastAsia="Yu Gothic" w:hAnsi="Yu Gothic"/>
+                <w:b w:val="false"/>
+                <w:bCs w:val="false"/>
+                <w:color w:val="000000"/>
+                <w:sz w:val="19"/>
+                <w:szCs w:val="19"/>
+              </w:rPr>
+              <w:t xml:space="preserve">「コンテンツの有効化」を押す。これで使えます</w:t>
+            </w:r>
+          </w:p>
+        </w:tc>
+      </w:tr>
+      <w:tr>
+        <w:trPr>
+          <w:cantSplit/>
+        </w:trPr>
+        <w:tc>
+          <w:tcPr>
+            <w:tcW w:type="dxa" w:w="4337"/>
+            <w:tcBorders>
+              <w:top w:val="single" w:color="B8CBD4" w:sz="4"/>
+              <w:left w:val="single" w:color="B8CBD4" w:sz="4"/>
+              <w:bottom w:val="single" w:color="B8CBD4" w:sz="4"/>
+              <w:right w:val="single" w:color="B8CBD4" w:sz="4"/>
+            </w:tcBorders>
+            <w:shd w:fill="F2F5F7" w:color="auto" w:val="clear"/>
+            <w:tcMar>
+              <w:top w:type="dxa" w:w="60"/>
+              <w:left w:type="dxa" w:w="100"/>
+              <w:bottom w:type="dxa" w:w="60"/>
+              <w:right w:type="dxa" w:w="100"/>
+            </w:tcMar>
+          </w:tcPr>
+          <w:p>
+            <w:pPr>
+              <w:spacing w:after="0" w:line="260"/>
+            </w:pPr>
+            <w:r>
+              <w:rPr>
+                <w:rFonts w:ascii="Yu Gothic" w:cs="Yu Gothic" w:eastAsia="Yu Gothic" w:hAnsi="Yu Gothic"/>
+                <w:b w:val="false"/>
+                <w:bCs w:val="false"/>
+                <w:color w:val="000000"/>
+                <w:sz w:val="19"/>
+                <w:szCs w:val="19"/>
+              </w:rPr>
+              <w:t xml:space="preserve">赤い帯「セキュリティ リスク　このファイルのソースが信頼できないため、Microsoft によりマクロの実行がブロックされました」</w:t>
+            </w:r>
+          </w:p>
+        </w:tc>
+        <w:tc>
+          <w:tcPr>
+            <w:tcW w:type="dxa" w:w="5301"/>
+            <w:tcBorders>
+              <w:top w:val="single" w:color="B8CBD4" w:sz="4"/>
+              <w:left w:val="single" w:color="B8CBD4" w:sz="4"/>
+              <w:bottom w:val="single" w:color="B8CBD4" w:sz="4"/>
+              <w:right w:val="single" w:color="B8CBD4" w:sz="4"/>
+            </w:tcBorders>
+            <w:shd w:fill="F2F5F7" w:color="auto" w:val="clear"/>
+            <w:tcMar>
+              <w:top w:type="dxa" w:w="60"/>
+              <w:left w:type="dxa" w:w="100"/>
+              <w:bottom w:type="dxa" w:w="60"/>
+              <w:right w:type="dxa" w:w="100"/>
+            </w:tcMar>
+          </w:tcPr>
+          <w:p>
+            <w:pPr>
+              <w:spacing w:after="0" w:line="260"/>
+            </w:pPr>
+            <w:r>
+              <w:rPr>
+                <w:rFonts w:ascii="Yu Gothic" w:cs="Yu Gothic" w:eastAsia="Yu Gothic" w:hAnsi="Yu Gothic"/>
+                <w:b w:val="false"/>
+                <w:bCs w:val="false"/>
+                <w:color w:val="000000"/>
+                <w:sz w:val="19"/>
+                <w:szCs w:val="19"/>
+              </w:rPr>
+              <w:t xml:space="preserve">下の「赤い帯が出たとき」の手順でブロックを解除する（ファイルごとに1回だけ）</w:t>
+            </w:r>
+          </w:p>
+        </w:tc>
+      </w:tr>
+      <w:tr>
+        <w:trPr>
+          <w:cantSplit/>
+        </w:trPr>
+        <w:tc>
+          <w:tcPr>
+            <w:tcW w:type="dxa" w:w="4337"/>
+            <w:tcBorders>
+              <w:top w:val="single" w:color="B8CBD4" w:sz="4"/>
+              <w:left w:val="single" w:color="B8CBD4" w:sz="4"/>
+              <w:bottom w:val="single" w:color="B8CBD4" w:sz="4"/>
+              <w:right w:val="single" w:color="B8CBD4" w:sz="4"/>
+            </w:tcBorders>
+            <w:shd w:fill="FFFFFF" w:color="auto" w:val="clear"/>
+            <w:tcMar>
+              <w:top w:type="dxa" w:w="60"/>
+              <w:left w:type="dxa" w:w="100"/>
+              <w:bottom w:type="dxa" w:w="60"/>
+              <w:right w:type="dxa" w:w="100"/>
+            </w:tcMar>
+          </w:tcPr>
+          <w:p>
+            <w:pPr>
+              <w:spacing w:after="0" w:line="260"/>
+            </w:pPr>
+            <w:r>
+              <w:rPr>
+                <w:rFonts w:ascii="Yu Gothic" w:cs="Yu Gothic" w:eastAsia="Yu Gothic" w:hAnsi="Yu Gothic"/>
+                <w:b w:val="false"/>
+                <w:bCs w:val="false"/>
+                <w:color w:val="000000"/>
+                <w:sz w:val="19"/>
+                <w:szCs w:val="19"/>
+              </w:rPr>
+              <w:t xml:space="preserve">帯が出ない</w:t>
+            </w:r>
+          </w:p>
+        </w:tc>
+        <w:tc>
+          <w:tcPr>
+            <w:tcW w:type="dxa" w:w="5301"/>
+            <w:tcBorders>
+              <w:top w:val="single" w:color="B8CBD4" w:sz="4"/>
+              <w:left w:val="single" w:color="B8CBD4" w:sz="4"/>
+              <w:bottom w:val="single" w:color="B8CBD4" w:sz="4"/>
+              <w:right w:val="single" w:color="B8CBD4" w:sz="4"/>
+            </w:tcBorders>
+            <w:shd w:fill="FFFFFF" w:color="auto" w:val="clear"/>
+            <w:tcMar>
+              <w:top w:type="dxa" w:w="60"/>
+              <w:left w:type="dxa" w:w="100"/>
+              <w:bottom w:type="dxa" w:w="60"/>
+              <w:right w:type="dxa" w:w="100"/>
+            </w:tcMar>
+          </w:tcPr>
+          <w:p>
+            <w:pPr>
+              <w:spacing w:after="0" w:line="260"/>
+            </w:pPr>
+            <w:r>
+              <w:rPr>
+                <w:rFonts w:ascii="Yu Gothic" w:cs="Yu Gothic" w:eastAsia="Yu Gothic" w:hAnsi="Yu Gothic"/>
+                <w:b w:val="false"/>
+                <w:bCs w:val="false"/>
+                <w:color w:val="000000"/>
+                <w:sz w:val="19"/>
+                <w:szCs w:val="19"/>
+              </w:rPr>
+              <w:t xml:space="preserve">そのまま使えます</w:t>
+            </w:r>
+          </w:p>
+        </w:tc>
+      </w:tr>
+    </w:tbl>
+    <w:p>
+      <w:pPr>
+        <w:spacing w:after="60"/>
+      </w:pPr>
+    </w:p>
+    <w:p>
+      <w:pPr>
+        <w:pStyle w:val="Heading2"/>
+        <w:pBdr>
+          <w:bottom w:val="single" w:color="0A7B6C" w:sz="8" w:space="2"/>
+        </w:pBdr>
+        <w:spacing w:after="100" w:before="240"/>
+      </w:pPr>
+      <w:r>
+        <w:rPr>
+          <w:rFonts w:ascii="Yu Gothic" w:cs="Yu Gothic" w:eastAsia="Yu Gothic" w:hAnsi="Yu Gothic"/>
+          <w:b/>
+          <w:bCs/>
+          <w:color w:val="0A7B6C"/>
+          <w:sz w:val="24"/>
+          <w:szCs w:val="24"/>
+        </w:rPr>
+        <w:t xml:space="preserve">赤い帯が出たとき（ブロックの解除）</w:t>
+      </w:r>
+    </w:p>
+    <w:p>
+      <w:pPr>
+        <w:spacing w:after="100" w:line="300"/>
+      </w:pPr>
+      <w:r>
+        <w:rPr>
+          <w:rFonts w:ascii="Yu Gothic" w:cs="Yu Gothic" w:eastAsia="Yu Gothic" w:hAnsi="Yu Gothic"/>
+          <w:sz w:val="21"/>
+          <w:szCs w:val="21"/>
+        </w:rPr>
+        <w:t xml:space="preserve">メールやダウンロードで受け取ったファイルは、Windows が「他のコンピューターから取得したファイル」として扱い、マクロを止めます。次の手順で解除します。</w:t>
+      </w:r>
+    </w:p>
+    <w:p>
+      <w:pPr>
         <w:pStyle w:val="ListParagraph"/>
         <w:numPr>
           <w:ilvl w:val="0"/>
@@ -1038,7 +1398,7 @@
           <w:sz w:val="21"/>
           <w:szCs w:val="21"/>
         </w:rPr>
-        <w:t xml:space="preserve">コピーしたファイルを開きます。</w:t>
+        <w:t xml:space="preserve">Excel を閉じます。</w:t>
       </w:r>
     </w:p>
     <w:p>
@@ -1056,7 +1416,7 @@
           <w:sz w:val="21"/>
           <w:szCs w:val="21"/>
         </w:rPr>
-        <w:t xml:space="preserve">上部に黄色い帯で「セキュリティの警告　マクロが無効にされました」と出たら「コンテンツの有効化」を押します。</w:t>
+        <w:t xml:space="preserve">エクスプローラーでそのファイルを右クリック → 「プロパティ」。</w:t>
       </w:r>
     </w:p>
     <w:p>
@@ -1074,7 +1434,25 @@
           <w:sz w:val="21"/>
           <w:szCs w:val="21"/>
         </w:rPr>
-        <w:t xml:space="preserve">「表紙」シートが表示されれば OK です。</w:t>
+        <w:t xml:space="preserve">「全般」タブの一番下、「セキュリティ：このファイルは他のコンピューターから取得したものです…」の右にある「許可する」にチェックを入れて OK。</w:t>
+      </w:r>
+    </w:p>
+    <w:p>
+      <w:pPr>
+        <w:pStyle w:val="ListParagraph"/>
+        <w:numPr>
+          <w:ilvl w:val="0"/>
+          <w:numId w:val="4"/>
+        </w:numPr>
+        <w:spacing w:after="80" w:line="300"/>
+      </w:pPr>
+      <w:r>
+        <w:rPr>
+          <w:rFonts w:ascii="Yu Gothic" w:cs="Yu Gothic" w:eastAsia="Yu Gothic" w:hAnsi="Yu Gothic"/>
+          <w:sz w:val="21"/>
+          <w:szCs w:val="21"/>
+        </w:rPr>
+        <w:t xml:space="preserve">もう一度ファイルを開きます。黄色い帯に変わるので「コンテンツの有効化」を押します。</w:t>
       </w:r>
     </w:p>
     <w:tbl>
@@ -1112,6 +1490,19 @@
           </w:tcPr>
           <w:p>
             <w:pPr>
+              <w:spacing w:after="60" w:line="280"/>
+            </w:pPr>
+            <w:r>
+              <w:rPr>
+                <w:rFonts w:ascii="Yu Gothic" w:cs="Yu Gothic" w:eastAsia="Yu Gothic" w:hAnsi="Yu Gothic"/>
+                <w:sz w:val="19"/>
+                <w:szCs w:val="19"/>
+              </w:rPr>
+              <w:t xml:space="preserve">※ テンプレートで一度解除しておけば、そこからコピーした各日ファイルには引き継がれます。毎回の作業は不要です。</w:t>
+            </w:r>
+          </w:p>
+          <w:p>
+            <w:pPr>
               <w:spacing w:after="0" w:line="280"/>
             </w:pPr>
             <w:r>
@@ -1120,7 +1511,7 @@
                 <w:sz w:val="19"/>
                 <w:szCs w:val="19"/>
               </w:rPr>
-              <w:t xml:space="preserve">※ 警告が出ず、ボタンを押しても何も起きない場合は、ファイルを閉じて、右クリック → プロパティ → 「許可する」にチェック → 再度開いてください。</w:t>
+              <w:t xml:space="preserve">　 「許可する」のチェックが表示されない場合は、Excel の「ファイル → オプション → トラストセンター → トラストセンターの設定 → 信頼できる場所」で、受付ファイルを置くフォルダを追加してください。</w:t>
             </w:r>
           </w:p>
         </w:tc>

</xml_diff>

<commit_message>
Add Excel 2016/2019 compatible template and document version choice
Replace XLOOKUP/FILTER/SORTBY/LET/UNIQUE with INDEX+MATCH and an
INDIRECT-based name list so the reception workbook works without
dynamic arrays. The staff manual now explains which template to pick
by Excel version and the fallback when the name list is empty.

Co-Authored-By: Claude Fable 5.1 <noreply@anthropic.com>
Claude-Session: https://claude.ai/code/session_011jJw2pCa25gsUc64u4BE6s
</commit_message>
<xml_diff>
--- a/excel-reception/事務員向け_受付ファイル作成手順書.docx
+++ b/excel-reception/事務員向け_受付ファイル作成手順書.docx
@@ -62,7 +62,7 @@
           <w:sz w:val="21"/>
           <w:szCs w:val="21"/>
         </w:rPr>
-        <w:t xml:space="preserve">対象ファイル：インフル予防接種受付_テンプレート.xlsm</w:t>
+        <w:t xml:space="preserve">対象ファイル：インフル予防接種受付_テンプレート.xlsm（Microsoft 365 / Excel 2021 以降）</w:t>
       </w:r>
     </w:p>
     <w:p>
@@ -76,7 +76,7 @@
           <w:sz w:val="21"/>
           <w:szCs w:val="21"/>
         </w:rPr>
-        <w:t xml:space="preserve">必要環境：Microsoft 365 または Excel 2021 以降（マクロ有効）</w:t>
+        <w:t xml:space="preserve">　　　　　　　インフル予防接種受付_テンプレート_Excel2019以前用.xlsm（Excel 2016 / 2019）</w:t>
       </w:r>
     </w:p>
     <w:p>
@@ -211,9 +211,448 @@
           <w:sz w:val="21"/>
           <w:szCs w:val="21"/>
         </w:rPr>
-        <w:t xml:space="preserve">Excel、テンプレート「インフル予防接種受付_テンプレート.xlsm」、申込名簿</w:t>
-      </w:r>
-    </w:p>
+        <w:t xml:space="preserve">Excel、テンプレート（下記の2種類から1つ）、申込名簿</w:t>
+      </w:r>
+    </w:p>
+    <w:p>
+      <w:pPr>
+        <w:spacing w:after="60"/>
+      </w:pPr>
+    </w:p>
+    <w:p>
+      <w:pPr>
+        <w:pStyle w:val="Heading2"/>
+        <w:pBdr>
+          <w:bottom w:val="single" w:color="0A7B6C" w:sz="8" w:space="2"/>
+        </w:pBdr>
+        <w:spacing w:after="100" w:before="240"/>
+      </w:pPr>
+      <w:r>
+        <w:rPr>
+          <w:rFonts w:ascii="Yu Gothic" w:cs="Yu Gothic" w:eastAsia="Yu Gothic" w:hAnsi="Yu Gothic"/>
+          <w:b/>
+          <w:bCs/>
+          <w:color w:val="0A7B6C"/>
+          <w:sz w:val="24"/>
+          <w:szCs w:val="24"/>
+        </w:rPr>
+        <w:t xml:space="preserve">テンプレートはExcelのバージョンで選ぶ</w:t>
+      </w:r>
+    </w:p>
+    <w:p>
+      <w:pPr>
+        <w:spacing w:after="100" w:line="300"/>
+      </w:pPr>
+      <w:r>
+        <w:rPr>
+          <w:rFonts w:ascii="Yu Gothic" w:cs="Yu Gothic" w:eastAsia="Yu Gothic" w:hAnsi="Yu Gothic"/>
+          <w:sz w:val="21"/>
+          <w:szCs w:val="21"/>
+        </w:rPr>
+        <w:t xml:space="preserve">Excel の「ファイル → アカウント」を開くと、右側に製品名が表示されます。それに合わせてテンプレートを選びます。</w:t>
+      </w:r>
+    </w:p>
+    <w:tbl>
+      <w:tblPr>
+        <w:tblW w:type="dxa" w:w="9638"/>
+        <w:tblBorders>
+          <w:top w:val="single" w:color="auto" w:sz="4"/>
+          <w:left w:val="single" w:color="auto" w:sz="4"/>
+          <w:bottom w:val="single" w:color="auto" w:sz="4"/>
+          <w:right w:val="single" w:color="auto" w:sz="4"/>
+          <w:insideH w:val="single" w:color="auto" w:sz="4"/>
+          <w:insideV w:val="single" w:color="auto" w:sz="4"/>
+        </w:tblBorders>
+      </w:tblPr>
+      <w:tblGrid>
+        <w:gridCol w:w="2409"/>
+        <w:gridCol w:w="3212"/>
+        <w:gridCol w:w="4017"/>
+      </w:tblGrid>
+      <w:tr>
+        <w:trPr>
+          <w:tblHeader/>
+        </w:trPr>
+        <w:tc>
+          <w:tcPr>
+            <w:tcW w:type="dxa" w:w="2409"/>
+            <w:tcBorders>
+              <w:top w:val="single" w:color="B8CBD4" w:sz="4"/>
+              <w:left w:val="single" w:color="B8CBD4" w:sz="4"/>
+              <w:bottom w:val="single" w:color="B8CBD4" w:sz="4"/>
+              <w:right w:val="single" w:color="B8CBD4" w:sz="4"/>
+            </w:tcBorders>
+            <w:shd w:fill="0F2847" w:color="auto" w:val="clear"/>
+            <w:tcMar>
+              <w:top w:type="dxa" w:w="60"/>
+              <w:left w:type="dxa" w:w="100"/>
+              <w:bottom w:type="dxa" w:w="60"/>
+              <w:right w:type="dxa" w:w="100"/>
+            </w:tcMar>
+          </w:tcPr>
+          <w:p>
+            <w:pPr>
+              <w:spacing w:after="0" w:line="260"/>
+            </w:pPr>
+            <w:r>
+              <w:rPr>
+                <w:rFonts w:ascii="Yu Gothic" w:cs="Yu Gothic" w:eastAsia="Yu Gothic" w:hAnsi="Yu Gothic"/>
+                <w:b/>
+                <w:bCs/>
+                <w:color w:val="FFFFFF"/>
+                <w:sz w:val="19"/>
+                <w:szCs w:val="19"/>
+              </w:rPr>
+              <w:t xml:space="preserve">お使いの Excel</w:t>
+            </w:r>
+          </w:p>
+        </w:tc>
+        <w:tc>
+          <w:tcPr>
+            <w:tcW w:type="dxa" w:w="3212"/>
+            <w:tcBorders>
+              <w:top w:val="single" w:color="B8CBD4" w:sz="4"/>
+              <w:left w:val="single" w:color="B8CBD4" w:sz="4"/>
+              <w:bottom w:val="single" w:color="B8CBD4" w:sz="4"/>
+              <w:right w:val="single" w:color="B8CBD4" w:sz="4"/>
+            </w:tcBorders>
+            <w:shd w:fill="0F2847" w:color="auto" w:val="clear"/>
+            <w:tcMar>
+              <w:top w:type="dxa" w:w="60"/>
+              <w:left w:type="dxa" w:w="100"/>
+              <w:bottom w:type="dxa" w:w="60"/>
+              <w:right w:type="dxa" w:w="100"/>
+            </w:tcMar>
+          </w:tcPr>
+          <w:p>
+            <w:pPr>
+              <w:spacing w:after="0" w:line="260"/>
+            </w:pPr>
+            <w:r>
+              <w:rPr>
+                <w:rFonts w:ascii="Yu Gothic" w:cs="Yu Gothic" w:eastAsia="Yu Gothic" w:hAnsi="Yu Gothic"/>
+                <w:b/>
+                <w:bCs/>
+                <w:color w:val="FFFFFF"/>
+                <w:sz w:val="19"/>
+                <w:szCs w:val="19"/>
+              </w:rPr>
+              <w:t xml:space="preserve">使うテンプレート</w:t>
+            </w:r>
+          </w:p>
+        </w:tc>
+        <w:tc>
+          <w:tcPr>
+            <w:tcW w:type="dxa" w:w="4017"/>
+            <w:tcBorders>
+              <w:top w:val="single" w:color="B8CBD4" w:sz="4"/>
+              <w:left w:val="single" w:color="B8CBD4" w:sz="4"/>
+              <w:bottom w:val="single" w:color="B8CBD4" w:sz="4"/>
+              <w:right w:val="single" w:color="B8CBD4" w:sz="4"/>
+            </w:tcBorders>
+            <w:shd w:fill="0F2847" w:color="auto" w:val="clear"/>
+            <w:tcMar>
+              <w:top w:type="dxa" w:w="60"/>
+              <w:left w:type="dxa" w:w="100"/>
+              <w:bottom w:type="dxa" w:w="60"/>
+              <w:right w:type="dxa" w:w="100"/>
+            </w:tcMar>
+          </w:tcPr>
+          <w:p>
+            <w:pPr>
+              <w:spacing w:after="0" w:line="260"/>
+            </w:pPr>
+            <w:r>
+              <w:rPr>
+                <w:rFonts w:ascii="Yu Gothic" w:cs="Yu Gothic" w:eastAsia="Yu Gothic" w:hAnsi="Yu Gothic"/>
+                <w:b/>
+                <w:bCs/>
+                <w:color w:val="FFFFFF"/>
+                <w:sz w:val="19"/>
+                <w:szCs w:val="19"/>
+              </w:rPr>
+              <w:t xml:space="preserve">違い</w:t>
+            </w:r>
+          </w:p>
+        </w:tc>
+      </w:tr>
+      <w:tr>
+        <w:trPr>
+          <w:cantSplit/>
+        </w:trPr>
+        <w:tc>
+          <w:tcPr>
+            <w:tcW w:type="dxa" w:w="2409"/>
+            <w:tcBorders>
+              <w:top w:val="single" w:color="B8CBD4" w:sz="4"/>
+              <w:left w:val="single" w:color="B8CBD4" w:sz="4"/>
+              <w:bottom w:val="single" w:color="B8CBD4" w:sz="4"/>
+              <w:right w:val="single" w:color="B8CBD4" w:sz="4"/>
+            </w:tcBorders>
+            <w:shd w:fill="FFFFFF" w:color="auto" w:val="clear"/>
+            <w:tcMar>
+              <w:top w:type="dxa" w:w="60"/>
+              <w:left w:type="dxa" w:w="100"/>
+              <w:bottom w:type="dxa" w:w="60"/>
+              <w:right w:type="dxa" w:w="100"/>
+            </w:tcMar>
+          </w:tcPr>
+          <w:p>
+            <w:pPr>
+              <w:spacing w:after="0" w:line="260"/>
+            </w:pPr>
+            <w:r>
+              <w:rPr>
+                <w:rFonts w:ascii="Yu Gothic" w:cs="Yu Gothic" w:eastAsia="Yu Gothic" w:hAnsi="Yu Gothic"/>
+                <w:b w:val="false"/>
+                <w:bCs w:val="false"/>
+                <w:color w:val="000000"/>
+                <w:sz w:val="19"/>
+                <w:szCs w:val="19"/>
+              </w:rPr>
+              <w:t xml:space="preserve">Microsoft 365 / Excel 2021 / 2024</w:t>
+            </w:r>
+          </w:p>
+        </w:tc>
+        <w:tc>
+          <w:tcPr>
+            <w:tcW w:type="dxa" w:w="3212"/>
+            <w:tcBorders>
+              <w:top w:val="single" w:color="B8CBD4" w:sz="4"/>
+              <w:left w:val="single" w:color="B8CBD4" w:sz="4"/>
+              <w:bottom w:val="single" w:color="B8CBD4" w:sz="4"/>
+              <w:right w:val="single" w:color="B8CBD4" w:sz="4"/>
+            </w:tcBorders>
+            <w:shd w:fill="FFFFFF" w:color="auto" w:val="clear"/>
+            <w:tcMar>
+              <w:top w:type="dxa" w:w="60"/>
+              <w:left w:type="dxa" w:w="100"/>
+              <w:bottom w:type="dxa" w:w="60"/>
+              <w:right w:type="dxa" w:w="100"/>
+            </w:tcMar>
+          </w:tcPr>
+          <w:p>
+            <w:pPr>
+              <w:spacing w:after="0" w:line="260"/>
+            </w:pPr>
+            <w:r>
+              <w:rPr>
+                <w:rFonts w:ascii="Yu Gothic" w:cs="Yu Gothic" w:eastAsia="Yu Gothic" w:hAnsi="Yu Gothic"/>
+                <w:b w:val="false"/>
+                <w:bCs w:val="false"/>
+                <w:color w:val="000000"/>
+                <w:sz w:val="19"/>
+                <w:szCs w:val="19"/>
+              </w:rPr>
+              <w:t xml:space="preserve">インフル予防接種受付_テンプレート.xlsm</w:t>
+            </w:r>
+          </w:p>
+        </w:tc>
+        <w:tc>
+          <w:tcPr>
+            <w:tcW w:type="dxa" w:w="4017"/>
+            <w:tcBorders>
+              <w:top w:val="single" w:color="B8CBD4" w:sz="4"/>
+              <w:left w:val="single" w:color="B8CBD4" w:sz="4"/>
+              <w:bottom w:val="single" w:color="B8CBD4" w:sz="4"/>
+              <w:right w:val="single" w:color="B8CBD4" w:sz="4"/>
+            </w:tcBorders>
+            <w:shd w:fill="FFFFFF" w:color="auto" w:val="clear"/>
+            <w:tcMar>
+              <w:top w:type="dxa" w:w="60"/>
+              <w:left w:type="dxa" w:w="100"/>
+              <w:bottom w:type="dxa" w:w="60"/>
+              <w:right w:type="dxa" w:w="100"/>
+            </w:tcMar>
+          </w:tcPr>
+          <w:p>
+            <w:pPr>
+              <w:spacing w:after="0" w:line="260"/>
+            </w:pPr>
+            <w:r>
+              <w:rPr>
+                <w:rFonts w:ascii="Yu Gothic" w:cs="Yu Gothic" w:eastAsia="Yu Gothic" w:hAnsi="Yu Gothic"/>
+                <w:b w:val="false"/>
+                <w:bCs w:val="false"/>
+                <w:color w:val="000000"/>
+                <w:sz w:val="19"/>
+                <w:szCs w:val="19"/>
+              </w:rPr>
+              <w:t xml:space="preserve">氏名プルダウンが「選んだ会社の人だけ・カナ順」で出る</w:t>
+            </w:r>
+          </w:p>
+        </w:tc>
+      </w:tr>
+      <w:tr>
+        <w:trPr>
+          <w:cantSplit/>
+        </w:trPr>
+        <w:tc>
+          <w:tcPr>
+            <w:tcW w:type="dxa" w:w="2409"/>
+            <w:tcBorders>
+              <w:top w:val="single" w:color="B8CBD4" w:sz="4"/>
+              <w:left w:val="single" w:color="B8CBD4" w:sz="4"/>
+              <w:bottom w:val="single" w:color="B8CBD4" w:sz="4"/>
+              <w:right w:val="single" w:color="B8CBD4" w:sz="4"/>
+            </w:tcBorders>
+            <w:shd w:fill="F2F5F7" w:color="auto" w:val="clear"/>
+            <w:tcMar>
+              <w:top w:type="dxa" w:w="60"/>
+              <w:left w:type="dxa" w:w="100"/>
+              <w:bottom w:type="dxa" w:w="60"/>
+              <w:right w:type="dxa" w:w="100"/>
+            </w:tcMar>
+          </w:tcPr>
+          <w:p>
+            <w:pPr>
+              <w:spacing w:after="0" w:line="260"/>
+            </w:pPr>
+            <w:r>
+              <w:rPr>
+                <w:rFonts w:ascii="Yu Gothic" w:cs="Yu Gothic" w:eastAsia="Yu Gothic" w:hAnsi="Yu Gothic"/>
+                <w:b w:val="false"/>
+                <w:bCs w:val="false"/>
+                <w:color w:val="000000"/>
+                <w:sz w:val="19"/>
+                <w:szCs w:val="19"/>
+              </w:rPr>
+              <w:t xml:space="preserve">Excel 2019 / 2016</w:t>
+            </w:r>
+          </w:p>
+        </w:tc>
+        <w:tc>
+          <w:tcPr>
+            <w:tcW w:type="dxa" w:w="3212"/>
+            <w:tcBorders>
+              <w:top w:val="single" w:color="B8CBD4" w:sz="4"/>
+              <w:left w:val="single" w:color="B8CBD4" w:sz="4"/>
+              <w:bottom w:val="single" w:color="B8CBD4" w:sz="4"/>
+              <w:right w:val="single" w:color="B8CBD4" w:sz="4"/>
+            </w:tcBorders>
+            <w:shd w:fill="F2F5F7" w:color="auto" w:val="clear"/>
+            <w:tcMar>
+              <w:top w:type="dxa" w:w="60"/>
+              <w:left w:type="dxa" w:w="100"/>
+              <w:bottom w:type="dxa" w:w="60"/>
+              <w:right w:type="dxa" w:w="100"/>
+            </w:tcMar>
+          </w:tcPr>
+          <w:p>
+            <w:pPr>
+              <w:spacing w:after="0" w:line="260"/>
+            </w:pPr>
+            <w:r>
+              <w:rPr>
+                <w:rFonts w:ascii="Yu Gothic" w:cs="Yu Gothic" w:eastAsia="Yu Gothic" w:hAnsi="Yu Gothic"/>
+                <w:b w:val="false"/>
+                <w:bCs w:val="false"/>
+                <w:color w:val="000000"/>
+                <w:sz w:val="19"/>
+                <w:szCs w:val="19"/>
+              </w:rPr>
+              <w:t xml:space="preserve">インフル予防接種受付_テンプレート_Excel2019以前用.xlsm</w:t>
+            </w:r>
+          </w:p>
+        </w:tc>
+        <w:tc>
+          <w:tcPr>
+            <w:tcW w:type="dxa" w:w="4017"/>
+            <w:tcBorders>
+              <w:top w:val="single" w:color="B8CBD4" w:sz="4"/>
+              <w:left w:val="single" w:color="B8CBD4" w:sz="4"/>
+              <w:bottom w:val="single" w:color="B8CBD4" w:sz="4"/>
+              <w:right w:val="single" w:color="B8CBD4" w:sz="4"/>
+            </w:tcBorders>
+            <w:shd w:fill="F2F5F7" w:color="auto" w:val="clear"/>
+            <w:tcMar>
+              <w:top w:type="dxa" w:w="60"/>
+              <w:left w:type="dxa" w:w="100"/>
+              <w:bottom w:type="dxa" w:w="60"/>
+              <w:right w:type="dxa" w:w="100"/>
+            </w:tcMar>
+          </w:tcPr>
+          <w:p>
+            <w:pPr>
+              <w:spacing w:after="0" w:line="260"/>
+            </w:pPr>
+            <w:r>
+              <w:rPr>
+                <w:rFonts w:ascii="Yu Gothic" w:cs="Yu Gothic" w:eastAsia="Yu Gothic" w:hAnsi="Yu Gothic"/>
+                <w:b w:val="false"/>
+                <w:bCs w:val="false"/>
+                <w:color w:val="000000"/>
+                <w:sz w:val="19"/>
+                <w:szCs w:val="19"/>
+              </w:rPr>
+              <w:t xml:space="preserve">氏名プルダウンは「名簿の全員・名簿の並び順」で出る。1事業所1ファイルなので実用上は同じ</w:t>
+            </w:r>
+          </w:p>
+        </w:tc>
+      </w:tr>
+    </w:tbl>
+    <w:tbl>
+      <w:tblPr>
+        <w:tblW w:type="dxa" w:w="9638"/>
+        <w:tblBorders>
+          <w:top w:val="single" w:color="auto" w:sz="4"/>
+          <w:left w:val="single" w:color="auto" w:sz="4"/>
+          <w:bottom w:val="single" w:color="auto" w:sz="4"/>
+          <w:right w:val="single" w:color="auto" w:sz="4"/>
+          <w:insideH w:val="single" w:color="auto" w:sz="4"/>
+          <w:insideV w:val="single" w:color="auto" w:sz="4"/>
+        </w:tblBorders>
+      </w:tblPr>
+      <w:tblGrid>
+        <w:gridCol w:w="9638"/>
+      </w:tblGrid>
+      <w:tr>
+        <w:tc>
+          <w:tcPr>
+            <w:tcW w:type="dxa" w:w="9638"/>
+            <w:tcBorders>
+              <w:top w:val="nil"/>
+              <w:left w:val="single" w:color="0A7B6C" w:sz="24"/>
+              <w:bottom w:val="nil"/>
+              <w:right w:val="nil"/>
+            </w:tcBorders>
+            <w:shd w:fill="E6F5F3" w:color="auto" w:val="clear"/>
+            <w:tcMar>
+              <w:top w:type="dxa" w:w="100"/>
+              <w:left w:type="dxa" w:w="160"/>
+              <w:bottom w:type="dxa" w:w="100"/>
+              <w:right w:type="dxa" w:w="160"/>
+            </w:tcMar>
+          </w:tcPr>
+          <w:p>
+            <w:pPr>
+              <w:spacing w:after="60" w:line="280"/>
+            </w:pPr>
+            <w:r>
+              <w:rPr>
+                <w:rFonts w:ascii="Yu Gothic" w:cs="Yu Gothic" w:eastAsia="Yu Gothic" w:hAnsi="Yu Gothic"/>
+                <w:sz w:val="19"/>
+                <w:szCs w:val="19"/>
+              </w:rPr>
+              <w:t xml:space="preserve">※ 新しい方のテンプレートを古い Excel で開くと、カナ氏名などが「#NAME?」になり、氏名プルダウンが空になります。その場合は「Excel2019以前用」に切り替えてください。</w:t>
+            </w:r>
+          </w:p>
+          <w:p>
+            <w:pPr>
+              <w:spacing w:after="0" w:line="280"/>
+            </w:pPr>
+            <w:r>
+              <w:rPr>
+                <w:rFonts w:ascii="Yu Gothic" w:cs="Yu Gothic" w:eastAsia="Yu Gothic" w:hAnsi="Yu Gothic"/>
+                <w:sz w:val="19"/>
+                <w:szCs w:val="19"/>
+              </w:rPr>
+              <w:t xml:space="preserve">　 古い Excel 用テンプレートを使うときは、名簿をカナ順に並べてから貼ると、プルダウンがカナ順になって探しやすくなります。</w:t>
+            </w:r>
+          </w:p>
+        </w:tc>
+      </w:tr>
+    </w:tbl>
     <w:p>
       <w:pPr>
         <w:spacing w:after="60"/>
@@ -947,7 +1386,7 @@
           <w:sz w:val="21"/>
           <w:szCs w:val="21"/>
         </w:rPr>
-        <w:t xml:space="preserve">「インフル予防接種受付_テンプレート.xlsm」を右クリック → コピー → 貼り付け でコピーします。テンプレート本体は直接編集しないでください。</w:t>
+        <w:t xml:space="preserve">お使いの Excel に合ったテンプレート（第1章の表を参照）を右クリック → コピー → 貼り付け でコピーします。テンプレート本体は直接編集しないでください。</w:t>
       </w:r>
     </w:p>
     <w:p>
@@ -4081,7 +4520,7 @@
           <w:sz w:val="21"/>
           <w:szCs w:val="21"/>
         </w:rPr>
-        <w:t xml:space="preserve">会社名を選ぶと「氏名」のプルダウンに名簿の人がカナ順で出る。</w:t>
+        <w:t xml:space="preserve">会社名を選ぶと「氏名」のプルダウンに名簿の人が出る（365/2021 以降はカナ順、2019 以前用は名簿の並び順）。</w:t>
       </w:r>
     </w:p>
     <w:p>
@@ -4748,7 +5187,7 @@
                 <w:sz w:val="19"/>
                 <w:szCs w:val="19"/>
               </w:rPr>
-              <w:t xml:space="preserve">氏名プルダウンが「#NAME?」になる</w:t>
+              <w:t xml:space="preserve">カナ氏名などが「#NAME?」になる、氏名プルダウンが空</w:t>
             </w:r>
           </w:p>
         </w:tc>
@@ -4782,7 +5221,7 @@
                 <w:sz w:val="19"/>
                 <w:szCs w:val="19"/>
               </w:rPr>
-              <w:t xml:space="preserve">Excel が古い（FILTER / SORTBY 関数が無い）。Microsoft 365 か Excel 2021 以降を使う</w:t>
+              <w:t xml:space="preserve">Excel が 2019 以前。「インフル予防接種受付_テンプレート_Excel2019以前用.xlsm」で作り直す</w:t>
             </w:r>
           </w:p>
         </w:tc>
@@ -4821,7 +5260,7 @@
                 <w:sz w:val="19"/>
                 <w:szCs w:val="19"/>
               </w:rPr>
-              <w:t xml:space="preserve">受付No.が 1 から始まらない</w:t>
+              <w:t xml:space="preserve">（2019 以前用）氏名プルダウンに誰も出ない</w:t>
             </w:r>
           </w:p>
         </w:tc>
@@ -4855,7 +5294,7 @@
                 <w:sz w:val="19"/>
                 <w:szCs w:val="19"/>
               </w:rPr>
-              <w:t xml:space="preserve">動作確認で登録してしまった、または日付シートにデータが残っている。日付シートの行を削除し、C3 を 1 に戻す</w:t>
+              <w:t xml:space="preserve">受診者マスタに名簿が入っているか確認。出ない場合でも、氏名欄に名簿どおりの氏名を直接入力するか、「フリー3で検索」ボタンで呼び出せば受付登録できる</w:t>
             </w:r>
           </w:p>
         </w:tc>
@@ -4894,6 +5333,79 @@
                 <w:sz w:val="19"/>
                 <w:szCs w:val="19"/>
               </w:rPr>
+              <w:t xml:space="preserve">受付No.が 1 から始まらない</w:t>
+            </w:r>
+          </w:p>
+        </w:tc>
+        <w:tc>
+          <w:tcPr>
+            <w:tcW w:type="dxa" w:w="6265"/>
+            <w:tcBorders>
+              <w:top w:val="single" w:color="B8CBD4" w:sz="4"/>
+              <w:left w:val="single" w:color="B8CBD4" w:sz="4"/>
+              <w:bottom w:val="single" w:color="B8CBD4" w:sz="4"/>
+              <w:right w:val="single" w:color="B8CBD4" w:sz="4"/>
+            </w:tcBorders>
+            <w:shd w:fill="F2F5F7" w:color="auto" w:val="clear"/>
+            <w:tcMar>
+              <w:top w:type="dxa" w:w="60"/>
+              <w:left w:type="dxa" w:w="100"/>
+              <w:bottom w:type="dxa" w:w="60"/>
+              <w:right w:type="dxa" w:w="100"/>
+            </w:tcMar>
+          </w:tcPr>
+          <w:p>
+            <w:pPr>
+              <w:spacing w:after="0" w:line="260"/>
+            </w:pPr>
+            <w:r>
+              <w:rPr>
+                <w:rFonts w:ascii="Yu Gothic" w:cs="Yu Gothic" w:eastAsia="Yu Gothic" w:hAnsi="Yu Gothic"/>
+                <w:b w:val="false"/>
+                <w:bCs w:val="false"/>
+                <w:color w:val="000000"/>
+                <w:sz w:val="19"/>
+                <w:szCs w:val="19"/>
+              </w:rPr>
+              <w:t xml:space="preserve">動作確認で登録してしまった、または日付シートにデータが残っている。日付シートの行を削除し、C3 を 1 に戻す</w:t>
+            </w:r>
+          </w:p>
+        </w:tc>
+      </w:tr>
+      <w:tr>
+        <w:trPr>
+          <w:cantSplit/>
+        </w:trPr>
+        <w:tc>
+          <w:tcPr>
+            <w:tcW w:type="dxa" w:w="3373"/>
+            <w:tcBorders>
+              <w:top w:val="single" w:color="B8CBD4" w:sz="4"/>
+              <w:left w:val="single" w:color="B8CBD4" w:sz="4"/>
+              <w:bottom w:val="single" w:color="B8CBD4" w:sz="4"/>
+              <w:right w:val="single" w:color="B8CBD4" w:sz="4"/>
+            </w:tcBorders>
+            <w:shd w:fill="FFFFFF" w:color="auto" w:val="clear"/>
+            <w:tcMar>
+              <w:top w:type="dxa" w:w="60"/>
+              <w:left w:type="dxa" w:w="100"/>
+              <w:bottom w:type="dxa" w:w="60"/>
+              <w:right w:type="dxa" w:w="100"/>
+            </w:tcMar>
+          </w:tcPr>
+          <w:p>
+            <w:pPr>
+              <w:spacing w:after="0" w:line="260"/>
+            </w:pPr>
+            <w:r>
+              <w:rPr>
+                <w:rFonts w:ascii="Yu Gothic" w:cs="Yu Gothic" w:eastAsia="Yu Gothic" w:hAnsi="Yu Gothic"/>
+                <w:b/>
+                <w:bCs/>
+                <w:color w:val="000000"/>
+                <w:sz w:val="19"/>
+                <w:szCs w:val="19"/>
+              </w:rPr>
               <w:t xml:space="preserve">「既に受付済み」が誤って出る</w:t>
             </w:r>
           </w:p>
@@ -4907,7 +5419,7 @@
               <w:bottom w:val="single" w:color="B8CBD4" w:sz="4"/>
               <w:right w:val="single" w:color="B8CBD4" w:sz="4"/>
             </w:tcBorders>
-            <w:shd w:fill="F2F5F7" w:color="auto" w:val="clear"/>
+            <w:shd w:fill="FFFFFF" w:color="auto" w:val="clear"/>
             <w:tcMar>
               <w:top w:type="dxa" w:w="60"/>
               <w:left w:type="dxa" w:w="100"/>

</xml_diff>

<commit_message>
Adopt the pre-zoom Excel 2016+ build as the single template
Use the restyled, Excel 2016/2019 compatible workbook (without the
zoom or panel experiments) as インフル予防接種受付_テンプレート.xlsm and
drop the separate version-specific file. The staff manual now covers
one template, recommends a trusted folder to avoid the macro block,
and documents the hidden 便潜血 rows and the automatic age column.

Co-Authored-By: Claude Opus 5.5 <noreply@anthropic.com>
Claude-Session: https://claude.ai/code/session_011jJw2pCa25gsUc64u4BE6s
</commit_message>
<xml_diff>
--- a/excel-reception/事務員向け_受付ファイル作成手順書.docx
+++ b/excel-reception/事務員向け_受付ファイル作成手順書.docx
@@ -62,7 +62,7 @@
           <w:sz w:val="21"/>
           <w:szCs w:val="21"/>
         </w:rPr>
-        <w:t xml:space="preserve">対象ファイル：インフル予防接種受付_テンプレート.xlsm（Microsoft 365 / Excel 2021 以降）</w:t>
+        <w:t xml:space="preserve">対象ファイル：インフル予防接種受付_テンプレート.xlsm</w:t>
       </w:r>
     </w:p>
     <w:p>
@@ -76,7 +76,7 @@
           <w:sz w:val="21"/>
           <w:szCs w:val="21"/>
         </w:rPr>
-        <w:t xml:space="preserve">　　　　　　　インフル予防接種受付_テンプレート_Excel2019以前用.xlsm（Excel 2016 / 2019）</w:t>
+        <w:t xml:space="preserve">必要環境：Excel 2016 以降（Microsoft 365 も可）・マクロ有効</w:t>
       </w:r>
     </w:p>
     <w:p>
@@ -211,448 +211,9 @@
           <w:sz w:val="21"/>
           <w:szCs w:val="21"/>
         </w:rPr>
-        <w:t xml:space="preserve">Excel、テンプレート（下記の2種類から1つ）、申込名簿</w:t>
-      </w:r>
-    </w:p>
-    <w:p>
-      <w:pPr>
-        <w:spacing w:after="60"/>
-      </w:pPr>
-    </w:p>
-    <w:p>
-      <w:pPr>
-        <w:pStyle w:val="Heading2"/>
-        <w:pBdr>
-          <w:bottom w:val="single" w:color="0A7B6C" w:sz="8" w:space="2"/>
-        </w:pBdr>
-        <w:spacing w:after="100" w:before="240"/>
-      </w:pPr>
-      <w:r>
-        <w:rPr>
-          <w:rFonts w:ascii="Yu Gothic" w:cs="Yu Gothic" w:eastAsia="Yu Gothic" w:hAnsi="Yu Gothic"/>
-          <w:b/>
-          <w:bCs/>
-          <w:color w:val="0A7B6C"/>
-          <w:sz w:val="24"/>
-          <w:szCs w:val="24"/>
-        </w:rPr>
-        <w:t xml:space="preserve">テンプレートはExcelのバージョンで選ぶ</w:t>
-      </w:r>
-    </w:p>
-    <w:p>
-      <w:pPr>
-        <w:spacing w:after="100" w:line="300"/>
-      </w:pPr>
-      <w:r>
-        <w:rPr>
-          <w:rFonts w:ascii="Yu Gothic" w:cs="Yu Gothic" w:eastAsia="Yu Gothic" w:hAnsi="Yu Gothic"/>
-          <w:sz w:val="21"/>
-          <w:szCs w:val="21"/>
-        </w:rPr>
-        <w:t xml:space="preserve">Excel の「ファイル → アカウント」を開くと、右側に製品名が表示されます。それに合わせてテンプレートを選びます。</w:t>
-      </w:r>
-    </w:p>
-    <w:tbl>
-      <w:tblPr>
-        <w:tblW w:type="dxa" w:w="9638"/>
-        <w:tblBorders>
-          <w:top w:val="single" w:color="auto" w:sz="4"/>
-          <w:left w:val="single" w:color="auto" w:sz="4"/>
-          <w:bottom w:val="single" w:color="auto" w:sz="4"/>
-          <w:right w:val="single" w:color="auto" w:sz="4"/>
-          <w:insideH w:val="single" w:color="auto" w:sz="4"/>
-          <w:insideV w:val="single" w:color="auto" w:sz="4"/>
-        </w:tblBorders>
-      </w:tblPr>
-      <w:tblGrid>
-        <w:gridCol w:w="2409"/>
-        <w:gridCol w:w="3212"/>
-        <w:gridCol w:w="4017"/>
-      </w:tblGrid>
-      <w:tr>
-        <w:trPr>
-          <w:tblHeader/>
-        </w:trPr>
-        <w:tc>
-          <w:tcPr>
-            <w:tcW w:type="dxa" w:w="2409"/>
-            <w:tcBorders>
-              <w:top w:val="single" w:color="B8CBD4" w:sz="4"/>
-              <w:left w:val="single" w:color="B8CBD4" w:sz="4"/>
-              <w:bottom w:val="single" w:color="B8CBD4" w:sz="4"/>
-              <w:right w:val="single" w:color="B8CBD4" w:sz="4"/>
-            </w:tcBorders>
-            <w:shd w:fill="0F2847" w:color="auto" w:val="clear"/>
-            <w:tcMar>
-              <w:top w:type="dxa" w:w="60"/>
-              <w:left w:type="dxa" w:w="100"/>
-              <w:bottom w:type="dxa" w:w="60"/>
-              <w:right w:type="dxa" w:w="100"/>
-            </w:tcMar>
-          </w:tcPr>
-          <w:p>
-            <w:pPr>
-              <w:spacing w:after="0" w:line="260"/>
-            </w:pPr>
-            <w:r>
-              <w:rPr>
-                <w:rFonts w:ascii="Yu Gothic" w:cs="Yu Gothic" w:eastAsia="Yu Gothic" w:hAnsi="Yu Gothic"/>
-                <w:b/>
-                <w:bCs/>
-                <w:color w:val="FFFFFF"/>
-                <w:sz w:val="19"/>
-                <w:szCs w:val="19"/>
-              </w:rPr>
-              <w:t xml:space="preserve">お使いの Excel</w:t>
-            </w:r>
-          </w:p>
-        </w:tc>
-        <w:tc>
-          <w:tcPr>
-            <w:tcW w:type="dxa" w:w="3212"/>
-            <w:tcBorders>
-              <w:top w:val="single" w:color="B8CBD4" w:sz="4"/>
-              <w:left w:val="single" w:color="B8CBD4" w:sz="4"/>
-              <w:bottom w:val="single" w:color="B8CBD4" w:sz="4"/>
-              <w:right w:val="single" w:color="B8CBD4" w:sz="4"/>
-            </w:tcBorders>
-            <w:shd w:fill="0F2847" w:color="auto" w:val="clear"/>
-            <w:tcMar>
-              <w:top w:type="dxa" w:w="60"/>
-              <w:left w:type="dxa" w:w="100"/>
-              <w:bottom w:type="dxa" w:w="60"/>
-              <w:right w:type="dxa" w:w="100"/>
-            </w:tcMar>
-          </w:tcPr>
-          <w:p>
-            <w:pPr>
-              <w:spacing w:after="0" w:line="260"/>
-            </w:pPr>
-            <w:r>
-              <w:rPr>
-                <w:rFonts w:ascii="Yu Gothic" w:cs="Yu Gothic" w:eastAsia="Yu Gothic" w:hAnsi="Yu Gothic"/>
-                <w:b/>
-                <w:bCs/>
-                <w:color w:val="FFFFFF"/>
-                <w:sz w:val="19"/>
-                <w:szCs w:val="19"/>
-              </w:rPr>
-              <w:t xml:space="preserve">使うテンプレート</w:t>
-            </w:r>
-          </w:p>
-        </w:tc>
-        <w:tc>
-          <w:tcPr>
-            <w:tcW w:type="dxa" w:w="4017"/>
-            <w:tcBorders>
-              <w:top w:val="single" w:color="B8CBD4" w:sz="4"/>
-              <w:left w:val="single" w:color="B8CBD4" w:sz="4"/>
-              <w:bottom w:val="single" w:color="B8CBD4" w:sz="4"/>
-              <w:right w:val="single" w:color="B8CBD4" w:sz="4"/>
-            </w:tcBorders>
-            <w:shd w:fill="0F2847" w:color="auto" w:val="clear"/>
-            <w:tcMar>
-              <w:top w:type="dxa" w:w="60"/>
-              <w:left w:type="dxa" w:w="100"/>
-              <w:bottom w:type="dxa" w:w="60"/>
-              <w:right w:type="dxa" w:w="100"/>
-            </w:tcMar>
-          </w:tcPr>
-          <w:p>
-            <w:pPr>
-              <w:spacing w:after="0" w:line="260"/>
-            </w:pPr>
-            <w:r>
-              <w:rPr>
-                <w:rFonts w:ascii="Yu Gothic" w:cs="Yu Gothic" w:eastAsia="Yu Gothic" w:hAnsi="Yu Gothic"/>
-                <w:b/>
-                <w:bCs/>
-                <w:color w:val="FFFFFF"/>
-                <w:sz w:val="19"/>
-                <w:szCs w:val="19"/>
-              </w:rPr>
-              <w:t xml:space="preserve">違い</w:t>
-            </w:r>
-          </w:p>
-        </w:tc>
-      </w:tr>
-      <w:tr>
-        <w:trPr>
-          <w:cantSplit/>
-        </w:trPr>
-        <w:tc>
-          <w:tcPr>
-            <w:tcW w:type="dxa" w:w="2409"/>
-            <w:tcBorders>
-              <w:top w:val="single" w:color="B8CBD4" w:sz="4"/>
-              <w:left w:val="single" w:color="B8CBD4" w:sz="4"/>
-              <w:bottom w:val="single" w:color="B8CBD4" w:sz="4"/>
-              <w:right w:val="single" w:color="B8CBD4" w:sz="4"/>
-            </w:tcBorders>
-            <w:shd w:fill="FFFFFF" w:color="auto" w:val="clear"/>
-            <w:tcMar>
-              <w:top w:type="dxa" w:w="60"/>
-              <w:left w:type="dxa" w:w="100"/>
-              <w:bottom w:type="dxa" w:w="60"/>
-              <w:right w:type="dxa" w:w="100"/>
-            </w:tcMar>
-          </w:tcPr>
-          <w:p>
-            <w:pPr>
-              <w:spacing w:after="0" w:line="260"/>
-            </w:pPr>
-            <w:r>
-              <w:rPr>
-                <w:rFonts w:ascii="Yu Gothic" w:cs="Yu Gothic" w:eastAsia="Yu Gothic" w:hAnsi="Yu Gothic"/>
-                <w:b w:val="false"/>
-                <w:bCs w:val="false"/>
-                <w:color w:val="000000"/>
-                <w:sz w:val="19"/>
-                <w:szCs w:val="19"/>
-              </w:rPr>
-              <w:t xml:space="preserve">Microsoft 365 / Excel 2021 / 2024</w:t>
-            </w:r>
-          </w:p>
-        </w:tc>
-        <w:tc>
-          <w:tcPr>
-            <w:tcW w:type="dxa" w:w="3212"/>
-            <w:tcBorders>
-              <w:top w:val="single" w:color="B8CBD4" w:sz="4"/>
-              <w:left w:val="single" w:color="B8CBD4" w:sz="4"/>
-              <w:bottom w:val="single" w:color="B8CBD4" w:sz="4"/>
-              <w:right w:val="single" w:color="B8CBD4" w:sz="4"/>
-            </w:tcBorders>
-            <w:shd w:fill="FFFFFF" w:color="auto" w:val="clear"/>
-            <w:tcMar>
-              <w:top w:type="dxa" w:w="60"/>
-              <w:left w:type="dxa" w:w="100"/>
-              <w:bottom w:type="dxa" w:w="60"/>
-              <w:right w:type="dxa" w:w="100"/>
-            </w:tcMar>
-          </w:tcPr>
-          <w:p>
-            <w:pPr>
-              <w:spacing w:after="0" w:line="260"/>
-            </w:pPr>
-            <w:r>
-              <w:rPr>
-                <w:rFonts w:ascii="Yu Gothic" w:cs="Yu Gothic" w:eastAsia="Yu Gothic" w:hAnsi="Yu Gothic"/>
-                <w:b w:val="false"/>
-                <w:bCs w:val="false"/>
-                <w:color w:val="000000"/>
-                <w:sz w:val="19"/>
-                <w:szCs w:val="19"/>
-              </w:rPr>
-              <w:t xml:space="preserve">インフル予防接種受付_テンプレート.xlsm</w:t>
-            </w:r>
-          </w:p>
-        </w:tc>
-        <w:tc>
-          <w:tcPr>
-            <w:tcW w:type="dxa" w:w="4017"/>
-            <w:tcBorders>
-              <w:top w:val="single" w:color="B8CBD4" w:sz="4"/>
-              <w:left w:val="single" w:color="B8CBD4" w:sz="4"/>
-              <w:bottom w:val="single" w:color="B8CBD4" w:sz="4"/>
-              <w:right w:val="single" w:color="B8CBD4" w:sz="4"/>
-            </w:tcBorders>
-            <w:shd w:fill="FFFFFF" w:color="auto" w:val="clear"/>
-            <w:tcMar>
-              <w:top w:type="dxa" w:w="60"/>
-              <w:left w:type="dxa" w:w="100"/>
-              <w:bottom w:type="dxa" w:w="60"/>
-              <w:right w:type="dxa" w:w="100"/>
-            </w:tcMar>
-          </w:tcPr>
-          <w:p>
-            <w:pPr>
-              <w:spacing w:after="0" w:line="260"/>
-            </w:pPr>
-            <w:r>
-              <w:rPr>
-                <w:rFonts w:ascii="Yu Gothic" w:cs="Yu Gothic" w:eastAsia="Yu Gothic" w:hAnsi="Yu Gothic"/>
-                <w:b w:val="false"/>
-                <w:bCs w:val="false"/>
-                <w:color w:val="000000"/>
-                <w:sz w:val="19"/>
-                <w:szCs w:val="19"/>
-              </w:rPr>
-              <w:t xml:space="preserve">氏名プルダウンが「選んだ会社の人だけ・カナ順」で出る</w:t>
-            </w:r>
-          </w:p>
-        </w:tc>
-      </w:tr>
-      <w:tr>
-        <w:trPr>
-          <w:cantSplit/>
-        </w:trPr>
-        <w:tc>
-          <w:tcPr>
-            <w:tcW w:type="dxa" w:w="2409"/>
-            <w:tcBorders>
-              <w:top w:val="single" w:color="B8CBD4" w:sz="4"/>
-              <w:left w:val="single" w:color="B8CBD4" w:sz="4"/>
-              <w:bottom w:val="single" w:color="B8CBD4" w:sz="4"/>
-              <w:right w:val="single" w:color="B8CBD4" w:sz="4"/>
-            </w:tcBorders>
-            <w:shd w:fill="F2F5F7" w:color="auto" w:val="clear"/>
-            <w:tcMar>
-              <w:top w:type="dxa" w:w="60"/>
-              <w:left w:type="dxa" w:w="100"/>
-              <w:bottom w:type="dxa" w:w="60"/>
-              <w:right w:type="dxa" w:w="100"/>
-            </w:tcMar>
-          </w:tcPr>
-          <w:p>
-            <w:pPr>
-              <w:spacing w:after="0" w:line="260"/>
-            </w:pPr>
-            <w:r>
-              <w:rPr>
-                <w:rFonts w:ascii="Yu Gothic" w:cs="Yu Gothic" w:eastAsia="Yu Gothic" w:hAnsi="Yu Gothic"/>
-                <w:b w:val="false"/>
-                <w:bCs w:val="false"/>
-                <w:color w:val="000000"/>
-                <w:sz w:val="19"/>
-                <w:szCs w:val="19"/>
-              </w:rPr>
-              <w:t xml:space="preserve">Excel 2019 / 2016</w:t>
-            </w:r>
-          </w:p>
-        </w:tc>
-        <w:tc>
-          <w:tcPr>
-            <w:tcW w:type="dxa" w:w="3212"/>
-            <w:tcBorders>
-              <w:top w:val="single" w:color="B8CBD4" w:sz="4"/>
-              <w:left w:val="single" w:color="B8CBD4" w:sz="4"/>
-              <w:bottom w:val="single" w:color="B8CBD4" w:sz="4"/>
-              <w:right w:val="single" w:color="B8CBD4" w:sz="4"/>
-            </w:tcBorders>
-            <w:shd w:fill="F2F5F7" w:color="auto" w:val="clear"/>
-            <w:tcMar>
-              <w:top w:type="dxa" w:w="60"/>
-              <w:left w:type="dxa" w:w="100"/>
-              <w:bottom w:type="dxa" w:w="60"/>
-              <w:right w:type="dxa" w:w="100"/>
-            </w:tcMar>
-          </w:tcPr>
-          <w:p>
-            <w:pPr>
-              <w:spacing w:after="0" w:line="260"/>
-            </w:pPr>
-            <w:r>
-              <w:rPr>
-                <w:rFonts w:ascii="Yu Gothic" w:cs="Yu Gothic" w:eastAsia="Yu Gothic" w:hAnsi="Yu Gothic"/>
-                <w:b w:val="false"/>
-                <w:bCs w:val="false"/>
-                <w:color w:val="000000"/>
-                <w:sz w:val="19"/>
-                <w:szCs w:val="19"/>
-              </w:rPr>
-              <w:t xml:space="preserve">インフル予防接種受付_テンプレート_Excel2019以前用.xlsm</w:t>
-            </w:r>
-          </w:p>
-        </w:tc>
-        <w:tc>
-          <w:tcPr>
-            <w:tcW w:type="dxa" w:w="4017"/>
-            <w:tcBorders>
-              <w:top w:val="single" w:color="B8CBD4" w:sz="4"/>
-              <w:left w:val="single" w:color="B8CBD4" w:sz="4"/>
-              <w:bottom w:val="single" w:color="B8CBD4" w:sz="4"/>
-              <w:right w:val="single" w:color="B8CBD4" w:sz="4"/>
-            </w:tcBorders>
-            <w:shd w:fill="F2F5F7" w:color="auto" w:val="clear"/>
-            <w:tcMar>
-              <w:top w:type="dxa" w:w="60"/>
-              <w:left w:type="dxa" w:w="100"/>
-              <w:bottom w:type="dxa" w:w="60"/>
-              <w:right w:type="dxa" w:w="100"/>
-            </w:tcMar>
-          </w:tcPr>
-          <w:p>
-            <w:pPr>
-              <w:spacing w:after="0" w:line="260"/>
-            </w:pPr>
-            <w:r>
-              <w:rPr>
-                <w:rFonts w:ascii="Yu Gothic" w:cs="Yu Gothic" w:eastAsia="Yu Gothic" w:hAnsi="Yu Gothic"/>
-                <w:b w:val="false"/>
-                <w:bCs w:val="false"/>
-                <w:color w:val="000000"/>
-                <w:sz w:val="19"/>
-                <w:szCs w:val="19"/>
-              </w:rPr>
-              <w:t xml:space="preserve">氏名プルダウンは「名簿の全員・名簿の並び順」で出る。1事業所1ファイルなので実用上は同じ</w:t>
-            </w:r>
-          </w:p>
-        </w:tc>
-      </w:tr>
-    </w:tbl>
-    <w:tbl>
-      <w:tblPr>
-        <w:tblW w:type="dxa" w:w="9638"/>
-        <w:tblBorders>
-          <w:top w:val="single" w:color="auto" w:sz="4"/>
-          <w:left w:val="single" w:color="auto" w:sz="4"/>
-          <w:bottom w:val="single" w:color="auto" w:sz="4"/>
-          <w:right w:val="single" w:color="auto" w:sz="4"/>
-          <w:insideH w:val="single" w:color="auto" w:sz="4"/>
-          <w:insideV w:val="single" w:color="auto" w:sz="4"/>
-        </w:tblBorders>
-      </w:tblPr>
-      <w:tblGrid>
-        <w:gridCol w:w="9638"/>
-      </w:tblGrid>
-      <w:tr>
-        <w:tc>
-          <w:tcPr>
-            <w:tcW w:type="dxa" w:w="9638"/>
-            <w:tcBorders>
-              <w:top w:val="nil"/>
-              <w:left w:val="single" w:color="0A7B6C" w:sz="24"/>
-              <w:bottom w:val="nil"/>
-              <w:right w:val="nil"/>
-            </w:tcBorders>
-            <w:shd w:fill="E6F5F3" w:color="auto" w:val="clear"/>
-            <w:tcMar>
-              <w:top w:type="dxa" w:w="100"/>
-              <w:left w:type="dxa" w:w="160"/>
-              <w:bottom w:type="dxa" w:w="100"/>
-              <w:right w:type="dxa" w:w="160"/>
-            </w:tcMar>
-          </w:tcPr>
-          <w:p>
-            <w:pPr>
-              <w:spacing w:after="60" w:line="280"/>
-            </w:pPr>
-            <w:r>
-              <w:rPr>
-                <w:rFonts w:ascii="Yu Gothic" w:cs="Yu Gothic" w:eastAsia="Yu Gothic" w:hAnsi="Yu Gothic"/>
-                <w:sz w:val="19"/>
-                <w:szCs w:val="19"/>
-              </w:rPr>
-              <w:t xml:space="preserve">※ 新しい方のテンプレートを古い Excel で開くと、カナ氏名などが「#NAME?」になり、氏名プルダウンが空になります。その場合は「Excel2019以前用」に切り替えてください。</w:t>
-            </w:r>
-          </w:p>
-          <w:p>
-            <w:pPr>
-              <w:spacing w:after="0" w:line="280"/>
-            </w:pPr>
-            <w:r>
-              <w:rPr>
-                <w:rFonts w:ascii="Yu Gothic" w:cs="Yu Gothic" w:eastAsia="Yu Gothic" w:hAnsi="Yu Gothic"/>
-                <w:sz w:val="19"/>
-                <w:szCs w:val="19"/>
-              </w:rPr>
-              <w:t xml:space="preserve">　 古い Excel 用テンプレートを使うときは、名簿をカナ順に並べてから貼ると、プルダウンがカナ順になって探しやすくなります。</w:t>
-            </w:r>
-          </w:p>
-        </w:tc>
-      </w:tr>
-    </w:tbl>
+        <w:t xml:space="preserve">Excel、テンプレート「インフル予防接種受付_テンプレート.xlsm」、申込名簿</w:t>
+      </w:r>
+    </w:p>
     <w:p>
       <w:pPr>
         <w:spacing w:after="60"/>
@@ -908,7 +469,7 @@
                 <w:sz w:val="19"/>
                 <w:szCs w:val="19"/>
               </w:rPr>
-              <w:t xml:space="preserve">当日の受付画面。会社名→氏名の連動プルダウン、受付No.自動採番、「受付登録」ボタン</w:t>
+              <w:t xml:space="preserve">当日の受付画面。会社名→氏名の連動プルダウン（氏名はカナ順）、受付No.自動採番、「受付登録」ボタン。健診用の便潜血・オプション・備考欄は非表示にしてある</w:t>
             </w:r>
           </w:p>
         </w:tc>
@@ -981,7 +542,7 @@
                 <w:sz w:val="19"/>
                 <w:szCs w:val="19"/>
               </w:rPr>
-              <w:t xml:space="preserve">申込名簿を貼り付ける場所。受付が済むと「済」が付く</w:t>
+              <w:t xml:space="preserve">申込名簿を貼り付ける場所。受付が済むと「済」が付く。年齢は生年月日から自動計算</w:t>
             </w:r>
           </w:p>
         </w:tc>
@@ -1386,7 +947,7 @@
           <w:sz w:val="21"/>
           <w:szCs w:val="21"/>
         </w:rPr>
-        <w:t xml:space="preserve">お使いの Excel に合ったテンプレート（第1章の表を参照）を右クリック → コピー → 貼り付け でコピーします。テンプレート本体は直接編集しないでください。</w:t>
+        <w:t xml:space="preserve">「インフル予防接種受付_テンプレート.xlsm」を右クリック → コピー → 貼り付け でコピーします。テンプレート本体は直接編集しないでください。</w:t>
       </w:r>
     </w:p>
     <w:p>
@@ -1929,19 +1490,6 @@
           </w:tcPr>
           <w:p>
             <w:pPr>
-              <w:spacing w:after="60" w:line="280"/>
-            </w:pPr>
-            <w:r>
-              <w:rPr>
-                <w:rFonts w:ascii="Yu Gothic" w:cs="Yu Gothic" w:eastAsia="Yu Gothic" w:hAnsi="Yu Gothic"/>
-                <w:sz w:val="19"/>
-                <w:szCs w:val="19"/>
-              </w:rPr>
-              <w:t xml:space="preserve">※ テンプレートで一度解除しておけば、そこからコピーした各日ファイルには引き継がれます。毎回の作業は不要です。</w:t>
-            </w:r>
-          </w:p>
-          <w:p>
-            <w:pPr>
               <w:spacing w:after="0" w:line="280"/>
             </w:pPr>
             <w:r>
@@ -1950,7 +1498,7 @@
                 <w:sz w:val="19"/>
                 <w:szCs w:val="19"/>
               </w:rPr>
-              <w:t xml:space="preserve">　 「許可する」のチェックが表示されない場合は、Excel の「ファイル → オプション → トラストセンター → トラストセンターの設定 → 信頼できる場所」で、受付ファイルを置くフォルダを追加してください。</w:t>
+              <w:t xml:space="preserve">※ テンプレートで一度解除しておけば、そこからコピーした各日ファイルには引き継がれます。ただし、新しくダウンロードしたファイルはそのたびに解除が必要です。</w:t>
             </w:r>
           </w:p>
         </w:tc>
@@ -1958,21 +1506,35 @@
     </w:tbl>
     <w:p>
       <w:pPr>
-        <w:pStyle w:val="Heading1"/>
-        <w:shd w:fill="0A7B6C" w:color="auto" w:val="clear"/>
-        <w:spacing w:after="160" w:before="360"/>
-        <w:ind w:left="0"/>
+        <w:pStyle w:val="Heading2"/>
+        <w:pBdr>
+          <w:bottom w:val="single" w:color="0A7B6C" w:sz="8" w:space="2"/>
+        </w:pBdr>
+        <w:spacing w:after="100" w:before="240"/>
       </w:pPr>
       <w:r>
         <w:rPr>
           <w:rFonts w:ascii="Yu Gothic" w:cs="Yu Gothic" w:eastAsia="Yu Gothic" w:hAnsi="Yu Gothic"/>
           <w:b/>
           <w:bCs/>
-          <w:color w:val="FFFFFF"/>
-          <w:sz w:val="30"/>
-          <w:szCs w:val="30"/>
-        </w:rPr>
-        <w:t xml:space="preserve">4. 手順3　会社マスタに事業所名を入れる</w:t>
+          <w:color w:val="0A7B6C"/>
+          <w:sz w:val="24"/>
+          <w:szCs w:val="24"/>
+        </w:rPr>
+        <w:t xml:space="preserve">おすすめ：受付ファイル用フォルダを「信頼できる場所」に登録</w:t>
+      </w:r>
+    </w:p>
+    <w:p>
+      <w:pPr>
+        <w:spacing w:after="100" w:line="300"/>
+      </w:pPr>
+      <w:r>
+        <w:rPr>
+          <w:rFonts w:ascii="Yu Gothic" w:cs="Yu Gothic" w:eastAsia="Yu Gothic" w:hAnsi="Yu Gothic"/>
+          <w:sz w:val="21"/>
+          <w:szCs w:val="21"/>
+        </w:rPr>
+        <w:t xml:space="preserve">一度設定すると、そのフォルダに置いたファイルは赤い帯が出なくなり、毎回の解除が不要になります。事務員の PC と現場の PC の両方で設定しておくと安心です。</w:t>
       </w:r>
     </w:p>
     <w:p>
@@ -1990,7 +1552,7 @@
           <w:sz w:val="21"/>
           <w:szCs w:val="21"/>
         </w:rPr>
-        <w:t xml:space="preserve">「会社マスタ」シートを開きます。</w:t>
+        <w:t xml:space="preserve">受付ファイルを置くフォルダを作る（例：ドキュメントの中に「インフル受付」）。</w:t>
       </w:r>
     </w:p>
     <w:p>
@@ -2008,7 +1570,7 @@
           <w:sz w:val="21"/>
           <w:szCs w:val="21"/>
         </w:rPr>
-        <w:t xml:space="preserve">B4 セルに事業所名を入力します（例：KENWOOD）。</w:t>
+        <w:t xml:space="preserve">Excel の「ファイル → オプション → トラストセンター → トラストセンターの設定」を開く。</w:t>
       </w:r>
     </w:p>
     <w:p>
@@ -2017,6 +1579,115 @@
         <w:numPr>
           <w:ilvl w:val="0"/>
           <w:numId w:val="5"/>
+        </w:numPr>
+        <w:spacing w:after="80" w:line="300"/>
+      </w:pPr>
+      <w:r>
+        <w:rPr>
+          <w:rFonts w:ascii="Yu Gothic" w:cs="Yu Gothic" w:eastAsia="Yu Gothic" w:hAnsi="Yu Gothic"/>
+          <w:sz w:val="21"/>
+          <w:szCs w:val="21"/>
+        </w:rPr>
+        <w:t xml:space="preserve">「信頼できる場所」→「新しい場所の追加」→「参照」で、作ったフォルダを選ぶ。</w:t>
+      </w:r>
+    </w:p>
+    <w:p>
+      <w:pPr>
+        <w:pStyle w:val="ListParagraph"/>
+        <w:numPr>
+          <w:ilvl w:val="0"/>
+          <w:numId w:val="5"/>
+        </w:numPr>
+        <w:spacing w:after="80" w:line="300"/>
+      </w:pPr>
+      <w:r>
+        <w:rPr>
+          <w:rFonts w:ascii="Yu Gothic" w:cs="Yu Gothic" w:eastAsia="Yu Gothic" w:hAnsi="Yu Gothic"/>
+          <w:sz w:val="21"/>
+          <w:szCs w:val="21"/>
+        </w:rPr>
+        <w:t xml:space="preserve">「この場所のサブフォルダーも信頼する」にチェック → OK。</w:t>
+      </w:r>
+    </w:p>
+    <w:p>
+      <w:pPr>
+        <w:pStyle w:val="ListParagraph"/>
+        <w:numPr>
+          <w:ilvl w:val="0"/>
+          <w:numId w:val="5"/>
+        </w:numPr>
+        <w:spacing w:after="80" w:line="300"/>
+      </w:pPr>
+      <w:r>
+        <w:rPr>
+          <w:rFonts w:ascii="Yu Gothic" w:cs="Yu Gothic" w:eastAsia="Yu Gothic" w:hAnsi="Yu Gothic"/>
+          <w:sz w:val="21"/>
+          <w:szCs w:val="21"/>
+        </w:rPr>
+        <w:t xml:space="preserve">以後、テンプレートや受付ファイルはこのフォルダに入れてから開く。</w:t>
+      </w:r>
+    </w:p>
+    <w:p>
+      <w:pPr>
+        <w:pStyle w:val="Heading1"/>
+        <w:shd w:fill="0A7B6C" w:color="auto" w:val="clear"/>
+        <w:spacing w:after="160" w:before="360"/>
+        <w:ind w:left="0"/>
+      </w:pPr>
+      <w:r>
+        <w:rPr>
+          <w:rFonts w:ascii="Yu Gothic" w:cs="Yu Gothic" w:eastAsia="Yu Gothic" w:hAnsi="Yu Gothic"/>
+          <w:b/>
+          <w:bCs/>
+          <w:color w:val="FFFFFF"/>
+          <w:sz w:val="30"/>
+          <w:szCs w:val="30"/>
+        </w:rPr>
+        <w:t xml:space="preserve">4. 手順3　会社マスタに事業所名を入れる</w:t>
+      </w:r>
+    </w:p>
+    <w:p>
+      <w:pPr>
+        <w:pStyle w:val="ListParagraph"/>
+        <w:numPr>
+          <w:ilvl w:val="0"/>
+          <w:numId w:val="6"/>
+        </w:numPr>
+        <w:spacing w:after="80" w:line="300"/>
+      </w:pPr>
+      <w:r>
+        <w:rPr>
+          <w:rFonts w:ascii="Yu Gothic" w:cs="Yu Gothic" w:eastAsia="Yu Gothic" w:hAnsi="Yu Gothic"/>
+          <w:sz w:val="21"/>
+          <w:szCs w:val="21"/>
+        </w:rPr>
+        <w:t xml:space="preserve">「会社マスタ」シートを開きます。</w:t>
+      </w:r>
+    </w:p>
+    <w:p>
+      <w:pPr>
+        <w:pStyle w:val="ListParagraph"/>
+        <w:numPr>
+          <w:ilvl w:val="0"/>
+          <w:numId w:val="6"/>
+        </w:numPr>
+        <w:spacing w:after="80" w:line="300"/>
+      </w:pPr>
+      <w:r>
+        <w:rPr>
+          <w:rFonts w:ascii="Yu Gothic" w:cs="Yu Gothic" w:eastAsia="Yu Gothic" w:hAnsi="Yu Gothic"/>
+          <w:sz w:val="21"/>
+          <w:szCs w:val="21"/>
+        </w:rPr>
+        <w:t xml:space="preserve">B4 セルに事業所名を入力します（例：KENWOOD）。</w:t>
+      </w:r>
+    </w:p>
+    <w:p>
+      <w:pPr>
+        <w:pStyle w:val="ListParagraph"/>
+        <w:numPr>
+          <w:ilvl w:val="0"/>
+          <w:numId w:val="6"/>
         </w:numPr>
         <w:spacing w:after="80" w:line="300"/>
       </w:pPr>
@@ -3123,7 +2794,7 @@
                 <w:sz w:val="19"/>
                 <w:szCs w:val="19"/>
               </w:rPr>
-              <w:t xml:space="preserve"/>
+              <w:t xml:space="preserve">日付として貼る。入れると L列の年齢が自動計算される</w:t>
             </w:r>
           </w:p>
         </w:tc>
@@ -3653,7 +3324,7 @@
                 <w:sz w:val="19"/>
                 <w:szCs w:val="19"/>
               </w:rPr>
-              <w:t xml:space="preserve">貼らない</w:t>
+              <w:t xml:space="preserve">貼らない（数式）</w:t>
             </w:r>
           </w:p>
         </w:tc>
@@ -3687,7 +3358,7 @@
                 <w:sz w:val="19"/>
                 <w:szCs w:val="19"/>
               </w:rPr>
-              <w:t xml:space="preserve">自動列</w:t>
+              <w:t xml:space="preserve">自動列。年齢は生年月日から、その年度末（3/31）時点で計算</w:t>
             </w:r>
           </w:p>
         </w:tc>
@@ -4146,7 +3817,7 @@
         <w:pStyle w:val="ListParagraph"/>
         <w:numPr>
           <w:ilvl w:val="0"/>
-          <w:numId w:val="6"/>
+          <w:numId w:val="7"/>
         </w:numPr>
         <w:spacing w:after="80" w:line="300"/>
       </w:pPr>
@@ -4164,7 +3835,7 @@
         <w:pStyle w:val="ListParagraph"/>
         <w:numPr>
           <w:ilvl w:val="0"/>
-          <w:numId w:val="6"/>
+          <w:numId w:val="7"/>
         </w:numPr>
         <w:spacing w:after="80" w:line="300"/>
       </w:pPr>
@@ -4182,7 +3853,7 @@
         <w:pStyle w:val="ListParagraph"/>
         <w:numPr>
           <w:ilvl w:val="0"/>
-          <w:numId w:val="6"/>
+          <w:numId w:val="7"/>
         </w:numPr>
         <w:spacing w:after="80" w:line="300"/>
       </w:pPr>
@@ -4192,7 +3863,7 @@
           <w:sz w:val="21"/>
           <w:szCs w:val="21"/>
         </w:rPr>
-        <w:t xml:space="preserve">カナ氏名（E列）、会社名（I列）、フリー1〜3（M〜O列）も同じように貼る。</w:t>
+        <w:t xml:space="preserve">カナ氏名（E列）、性別（F列）、生年月日（G列）、会社名（I列）、フリー1〜3（M〜O列）も同じように貼る。</w:t>
       </w:r>
     </w:p>
     <w:p>
@@ -4200,7 +3871,7 @@
         <w:pStyle w:val="ListParagraph"/>
         <w:numPr>
           <w:ilvl w:val="0"/>
-          <w:numId w:val="6"/>
+          <w:numId w:val="7"/>
         </w:numPr>
         <w:spacing w:after="80" w:line="300"/>
       </w:pPr>
@@ -4266,6 +3937,24 @@
           <w:sz w:val="21"/>
           <w:szCs w:val="21"/>
         </w:rPr>
+        <w:t xml:space="preserve">生年月日を貼った人は、L列に年齢が表示されている。</w:t>
+      </w:r>
+    </w:p>
+    <w:p>
+      <w:pPr>
+        <w:pStyle w:val="ListParagraph"/>
+        <w:numPr>
+          <w:ilvl w:val="0"/>
+          <w:numId w:val="2"/>
+        </w:numPr>
+        <w:spacing w:after="60" w:line="300"/>
+      </w:pPr>
+      <w:r>
+        <w:rPr>
+          <w:rFonts w:ascii="Yu Gothic" w:cs="Yu Gothic" w:eastAsia="Yu Gothic" w:hAnsi="Yu Gothic"/>
+          <w:sz w:val="21"/>
+          <w:szCs w:val="21"/>
+        </w:rPr>
         <w:t xml:space="preserve">表の最終行より下に貼った場合、表（青い枠）が自動で広がっている。広がっていなければ、表の右下の小さな「┘」マークをドラッグして広げる。</w:t>
       </w:r>
     </w:p>
@@ -4293,7 +3982,7 @@
         <w:pStyle w:val="ListParagraph"/>
         <w:numPr>
           <w:ilvl w:val="0"/>
-          <w:numId w:val="7"/>
+          <w:numId w:val="8"/>
         </w:numPr>
         <w:spacing w:after="80" w:line="300"/>
       </w:pPr>
@@ -4311,7 +4000,7 @@
         <w:pStyle w:val="ListParagraph"/>
         <w:numPr>
           <w:ilvl w:val="0"/>
-          <w:numId w:val="7"/>
+          <w:numId w:val="8"/>
         </w:numPr>
         <w:spacing w:after="80" w:line="300"/>
       </w:pPr>
@@ -4329,7 +4018,7 @@
         <w:pStyle w:val="ListParagraph"/>
         <w:numPr>
           <w:ilvl w:val="0"/>
-          <w:numId w:val="7"/>
+          <w:numId w:val="8"/>
         </w:numPr>
         <w:spacing w:after="80" w:line="300"/>
       </w:pPr>
@@ -4357,7 +4046,7 @@
         <w:pStyle w:val="ListParagraph"/>
         <w:numPr>
           <w:ilvl w:val="0"/>
-          <w:numId w:val="7"/>
+          <w:numId w:val="8"/>
         </w:numPr>
         <w:spacing w:after="80" w:line="300"/>
       </w:pPr>
@@ -4456,7 +4145,7 @@
         <w:pStyle w:val="ListParagraph"/>
         <w:numPr>
           <w:ilvl w:val="0"/>
-          <w:numId w:val="8"/>
+          <w:numId w:val="9"/>
         </w:numPr>
         <w:spacing w:after="80" w:line="300"/>
       </w:pPr>
@@ -4474,7 +4163,7 @@
         <w:pStyle w:val="ListParagraph"/>
         <w:numPr>
           <w:ilvl w:val="0"/>
-          <w:numId w:val="8"/>
+          <w:numId w:val="9"/>
         </w:numPr>
         <w:spacing w:after="80" w:line="300"/>
       </w:pPr>
@@ -4492,7 +4181,7 @@
         <w:pStyle w:val="ListParagraph"/>
         <w:numPr>
           <w:ilvl w:val="0"/>
-          <w:numId w:val="8"/>
+          <w:numId w:val="9"/>
         </w:numPr>
         <w:spacing w:after="80" w:line="300"/>
       </w:pPr>
@@ -4510,7 +4199,7 @@
         <w:pStyle w:val="ListParagraph"/>
         <w:numPr>
           <w:ilvl w:val="0"/>
-          <w:numId w:val="8"/>
+          <w:numId w:val="9"/>
         </w:numPr>
         <w:spacing w:after="80" w:line="300"/>
       </w:pPr>
@@ -4520,7 +4209,7 @@
           <w:sz w:val="21"/>
           <w:szCs w:val="21"/>
         </w:rPr>
-        <w:t xml:space="preserve">会社名を選ぶと「氏名」のプルダウンに名簿の人が出る（365/2021 以降はカナ順、2019 以前用は名簿の並び順）。</w:t>
+        <w:t xml:space="preserve">会社名を選ぶと「氏名」のプルダウンに、その会社の人がカナ順で出る。</w:t>
       </w:r>
     </w:p>
     <w:p>
@@ -4528,7 +4217,7 @@
         <w:pStyle w:val="ListParagraph"/>
         <w:numPr>
           <w:ilvl w:val="0"/>
-          <w:numId w:val="8"/>
+          <w:numId w:val="9"/>
         </w:numPr>
         <w:spacing w:after="80" w:line="300"/>
       </w:pPr>
@@ -4538,7 +4227,7 @@
           <w:sz w:val="21"/>
           <w:szCs w:val="21"/>
         </w:rPr>
-        <w:t xml:space="preserve">氏名を選ぶと、カナ氏名・フリー1〜3 が自動表示される。</w:t>
+        <w:t xml:space="preserve">氏名を選ぶと、カナ氏名・性別・生年月日・年齢・フリー1〜3 が自動表示される。</w:t>
       </w:r>
     </w:p>
     <w:p>
@@ -4546,7 +4235,7 @@
         <w:pStyle w:val="ListParagraph"/>
         <w:numPr>
           <w:ilvl w:val="0"/>
-          <w:numId w:val="8"/>
+          <w:numId w:val="9"/>
         </w:numPr>
         <w:spacing w:after="80" w:line="300"/>
       </w:pPr>
@@ -4632,7 +4321,7 @@
         <w:pStyle w:val="ListParagraph"/>
         <w:numPr>
           <w:ilvl w:val="0"/>
-          <w:numId w:val="9"/>
+          <w:numId w:val="10"/>
         </w:numPr>
         <w:spacing w:after="80" w:line="300"/>
       </w:pPr>
@@ -4643,61 +4332,6 @@
           <w:szCs w:val="21"/>
         </w:rPr>
         <w:t xml:space="preserve">Ctrl + S で保存（形式は .xlsm のまま）。</w:t>
-      </w:r>
-    </w:p>
-    <w:p>
-      <w:pPr>
-        <w:pStyle w:val="ListParagraph"/>
-        <w:numPr>
-          <w:ilvl w:val="0"/>
-          <w:numId w:val="9"/>
-        </w:numPr>
-        <w:spacing w:after="80" w:line="300"/>
-      </w:pPr>
-      <w:r>
-        <w:rPr>
-          <w:rFonts w:ascii="Yu Gothic" w:cs="Yu Gothic" w:eastAsia="Yu Gothic" w:hAnsi="Yu Gothic"/>
-          <w:sz w:val="21"/>
-          <w:szCs w:val="21"/>
-        </w:rPr>
-        <w:t xml:space="preserve">現場で使う PC・共有フォルダにコピーします。</w:t>
-      </w:r>
-    </w:p>
-    <w:p>
-      <w:pPr>
-        <w:pStyle w:val="ListParagraph"/>
-        <w:numPr>
-          <w:ilvl w:val="0"/>
-          <w:numId w:val="9"/>
-        </w:numPr>
-        <w:spacing w:after="80" w:line="300"/>
-      </w:pPr>
-      <w:r>
-        <w:rPr>
-          <w:rFonts w:ascii="Yu Gothic" w:cs="Yu Gothic" w:eastAsia="Yu Gothic" w:hAnsi="Yu Gothic"/>
-          <w:sz w:val="21"/>
-          <w:szCs w:val="21"/>
-        </w:rPr>
-        <w:t xml:space="preserve">OneDrive 上で直接使う場合、同期の遅れでエラーが出ることがあるため、できればローカルにコピーして使ってください。</w:t>
-      </w:r>
-    </w:p>
-    <w:p>
-      <w:pPr>
-        <w:pStyle w:val="Heading1"/>
-        <w:shd w:fill="0A7B6C" w:color="auto" w:val="clear"/>
-        <w:spacing w:after="160" w:before="360"/>
-        <w:ind w:left="0"/>
-      </w:pPr>
-      <w:r>
-        <w:rPr>
-          <w:rFonts w:ascii="Yu Gothic" w:cs="Yu Gothic" w:eastAsia="Yu Gothic" w:hAnsi="Yu Gothic"/>
-          <w:b/>
-          <w:bCs/>
-          <w:color w:val="FFFFFF"/>
-          <w:sz w:val="30"/>
-          <w:szCs w:val="30"/>
-        </w:rPr>
-        <w:t xml:space="preserve">9. 当日の受付の流れ（現場スタッフ向けメモ）</w:t>
       </w:r>
     </w:p>
     <w:p>
@@ -4715,7 +4349,7 @@
           <w:sz w:val="21"/>
           <w:szCs w:val="21"/>
         </w:rPr>
-        <w:t xml:space="preserve">ファイルを開き「コンテンツの有効化」。</w:t>
+        <w:t xml:space="preserve">現場で使う PC・共有フォルダにコピーします。</w:t>
       </w:r>
     </w:p>
     <w:p>
@@ -4733,7 +4367,26 @@
           <w:sz w:val="21"/>
           <w:szCs w:val="21"/>
         </w:rPr>
-        <w:t xml:space="preserve">「入力シート」で会社名 → 氏名を選ぶ（または「🔍 フリー3で検索」で番号入力）。</w:t>
+        <w:t xml:space="preserve">OneDrive 上で直接使う場合、同期の遅れでエラーが出ることがあるため、できればローカルにコピーして使ってください。</w:t>
+      </w:r>
+    </w:p>
+    <w:p>
+      <w:pPr>
+        <w:pStyle w:val="Heading1"/>
+        <w:shd w:fill="0A7B6C" w:color="auto" w:val="clear"/>
+        <w:spacing w:after="160" w:before="360"/>
+        <w:ind w:left="0"/>
+      </w:pPr>
+      <w:r>
+        <w:rPr>
+          <w:rFonts w:ascii="Yu Gothic" w:cs="Yu Gothic" w:eastAsia="Yu Gothic" w:hAnsi="Yu Gothic"/>
+          <w:b/>
+          <w:bCs/>
+          <w:color w:val="FFFFFF"/>
+          <w:sz w:val="30"/>
+          <w:szCs w:val="30"/>
+        </w:rPr>
+        <w:t xml:space="preserve">9. 当日の受付の流れ（現場スタッフ向けメモ）</w:t>
       </w:r>
     </w:p>
     <w:p>
@@ -4741,7 +4394,7 @@
         <w:pStyle w:val="ListParagraph"/>
         <w:numPr>
           <w:ilvl w:val="0"/>
-          <w:numId w:val="10"/>
+          <w:numId w:val="11"/>
         </w:numPr>
         <w:spacing w:after="80" w:line="300"/>
       </w:pPr>
@@ -4751,7 +4404,7 @@
           <w:sz w:val="21"/>
           <w:szCs w:val="21"/>
         </w:rPr>
-        <w:t xml:space="preserve">「➕ 受付登録」を押す → 確認ダイアログで「はい」。</w:t>
+        <w:t xml:space="preserve">ファイルを開き「コンテンツの有効化」。</w:t>
       </w:r>
     </w:p>
     <w:p>
@@ -4759,7 +4412,7 @@
         <w:pStyle w:val="ListParagraph"/>
         <w:numPr>
           <w:ilvl w:val="0"/>
-          <w:numId w:val="10"/>
+          <w:numId w:val="11"/>
         </w:numPr>
         <w:spacing w:after="80" w:line="300"/>
       </w:pPr>
@@ -4769,7 +4422,7 @@
           <w:sz w:val="21"/>
           <w:szCs w:val="21"/>
         </w:rPr>
-        <w:t xml:space="preserve">日付シートに1行追加され、入力欄が自動で消え、受付No.が次の番号になる。</w:t>
+        <w:t xml:space="preserve">「入力シート」で会社名 → 氏名をプルダウンから選ぶ（または「🔍 フリー3で検索」で番号入力）。カナ氏名・生年月日などで本人確認する。</w:t>
       </w:r>
     </w:p>
     <w:p>
@@ -4777,7 +4430,7 @@
         <w:pStyle w:val="ListParagraph"/>
         <w:numPr>
           <w:ilvl w:val="0"/>
-          <w:numId w:val="10"/>
+          <w:numId w:val="11"/>
         </w:numPr>
         <w:spacing w:after="80" w:line="300"/>
       </w:pPr>
@@ -4787,7 +4440,7 @@
           <w:sz w:val="21"/>
           <w:szCs w:val="21"/>
         </w:rPr>
-        <w:t xml:space="preserve">同じ人を二度登録しようとすると「既に受付済みです」と警告が出る（通常は「いいえ」）。</w:t>
+        <w:t xml:space="preserve">「➕ 受付登録」を押す → 確認ダイアログで「はい」。</w:t>
       </w:r>
     </w:p>
     <w:p>
@@ -4795,7 +4448,7 @@
         <w:pStyle w:val="ListParagraph"/>
         <w:numPr>
           <w:ilvl w:val="0"/>
-          <w:numId w:val="10"/>
+          <w:numId w:val="11"/>
         </w:numPr>
         <w:spacing w:after="80" w:line="300"/>
       </w:pPr>
@@ -4805,7 +4458,7 @@
           <w:sz w:val="21"/>
           <w:szCs w:val="21"/>
         </w:rPr>
-        <w:t xml:space="preserve">便潜血・オプションの欄は健診用なので、空欄のまま登録して構いません。</w:t>
+        <w:t xml:space="preserve">日付シートに1行追加され、入力欄が自動で消え、受付No.が次の番号になる。</w:t>
       </w:r>
     </w:p>
     <w:p>
@@ -4813,7 +4466,25 @@
         <w:pStyle w:val="ListParagraph"/>
         <w:numPr>
           <w:ilvl w:val="0"/>
-          <w:numId w:val="10"/>
+          <w:numId w:val="11"/>
+        </w:numPr>
+        <w:spacing w:after="80" w:line="300"/>
+      </w:pPr>
+      <w:r>
+        <w:rPr>
+          <w:rFonts w:ascii="Yu Gothic" w:cs="Yu Gothic" w:eastAsia="Yu Gothic" w:hAnsi="Yu Gothic"/>
+          <w:sz w:val="21"/>
+          <w:szCs w:val="21"/>
+        </w:rPr>
+        <w:t xml:space="preserve">同じ人を二度登録しようとすると「既に受付済みです」と警告が出る（通常は「いいえ」）。</w:t>
+      </w:r>
+    </w:p>
+    <w:p>
+      <w:pPr>
+        <w:pStyle w:val="ListParagraph"/>
+        <w:numPr>
+          <w:ilvl w:val="0"/>
+          <w:numId w:val="11"/>
         </w:numPr>
         <w:spacing w:after="80" w:line="300"/>
       </w:pPr>
@@ -5187,7 +4858,7 @@
                 <w:sz w:val="19"/>
                 <w:szCs w:val="19"/>
               </w:rPr>
-              <w:t xml:space="preserve">カナ氏名などが「#NAME?」になる、氏名プルダウンが空</w:t>
+              <w:t xml:space="preserve">カナ氏名などが「#NAME?」になる</w:t>
             </w:r>
           </w:p>
         </w:tc>
@@ -5221,7 +4892,7 @@
                 <w:sz w:val="19"/>
                 <w:szCs w:val="19"/>
               </w:rPr>
-              <w:t xml:space="preserve">Excel が 2019 以前。「インフル予防接種受付_テンプレート_Excel2019以前用.xlsm」で作り直す</w:t>
+              <w:t xml:space="preserve">古いテンプレート（去年のファイル）を使っている。このテンプレートで作り直す</w:t>
             </w:r>
           </w:p>
         </w:tc>
@@ -5260,7 +4931,7 @@
                 <w:sz w:val="19"/>
                 <w:szCs w:val="19"/>
               </w:rPr>
-              <w:t xml:space="preserve">（2019 以前用）氏名プルダウンに誰も出ない</w:t>
+              <w:t xml:space="preserve">年齢が空欄</w:t>
             </w:r>
           </w:p>
         </w:tc>
@@ -5294,7 +4965,7 @@
                 <w:sz w:val="19"/>
                 <w:szCs w:val="19"/>
               </w:rPr>
-              <w:t xml:space="preserve">受診者マスタに名簿が入っているか確認。出ない場合でも、氏名欄に名簿どおりの氏名を直接入力するか、「フリー3で検索」ボタンで呼び出せば受付登録できる</w:t>
+              <w:t xml:space="preserve">受診者マスタの生年月日（G列）が空、または文字として貼られている。日付として入れ直す</w:t>
             </w:r>
           </w:p>
         </w:tc>
@@ -5333,7 +5004,7 @@
                 <w:sz w:val="19"/>
                 <w:szCs w:val="19"/>
               </w:rPr>
-              <w:t xml:space="preserve">受付No.が 1 から始まらない</w:t>
+              <w:t xml:space="preserve">「400」などのエラーが出る</w:t>
             </w:r>
           </w:p>
         </w:tc>
@@ -5367,7 +5038,7 @@
                 <w:sz w:val="19"/>
                 <w:szCs w:val="19"/>
               </w:rPr>
-              <w:t xml:space="preserve">動作確認で登録してしまった、または日付シートにデータが残っている。日付シートの行を削除し、C3 を 1 に戻す</w:t>
+              <w:t xml:space="preserve">Excel が古い PC で去年のファイルを開いている。このテンプレートで作り直す</w:t>
             </w:r>
           </w:p>
         </w:tc>
@@ -5406,6 +5077,79 @@
                 <w:sz w:val="19"/>
                 <w:szCs w:val="19"/>
               </w:rPr>
+              <w:t xml:space="preserve">受付No.が 1 から始まらない</w:t>
+            </w:r>
+          </w:p>
+        </w:tc>
+        <w:tc>
+          <w:tcPr>
+            <w:tcW w:type="dxa" w:w="6265"/>
+            <w:tcBorders>
+              <w:top w:val="single" w:color="B8CBD4" w:sz="4"/>
+              <w:left w:val="single" w:color="B8CBD4" w:sz="4"/>
+              <w:bottom w:val="single" w:color="B8CBD4" w:sz="4"/>
+              <w:right w:val="single" w:color="B8CBD4" w:sz="4"/>
+            </w:tcBorders>
+            <w:shd w:fill="FFFFFF" w:color="auto" w:val="clear"/>
+            <w:tcMar>
+              <w:top w:type="dxa" w:w="60"/>
+              <w:left w:type="dxa" w:w="100"/>
+              <w:bottom w:type="dxa" w:w="60"/>
+              <w:right w:type="dxa" w:w="100"/>
+            </w:tcMar>
+          </w:tcPr>
+          <w:p>
+            <w:pPr>
+              <w:spacing w:after="0" w:line="260"/>
+            </w:pPr>
+            <w:r>
+              <w:rPr>
+                <w:rFonts w:ascii="Yu Gothic" w:cs="Yu Gothic" w:eastAsia="Yu Gothic" w:hAnsi="Yu Gothic"/>
+                <w:b w:val="false"/>
+                <w:bCs w:val="false"/>
+                <w:color w:val="000000"/>
+                <w:sz w:val="19"/>
+                <w:szCs w:val="19"/>
+              </w:rPr>
+              <w:t xml:space="preserve">動作確認で登録してしまった、または日付シートにデータが残っている。日付シートの行を削除し、C3 を 1 に戻す</w:t>
+            </w:r>
+          </w:p>
+        </w:tc>
+      </w:tr>
+      <w:tr>
+        <w:trPr>
+          <w:cantSplit/>
+        </w:trPr>
+        <w:tc>
+          <w:tcPr>
+            <w:tcW w:type="dxa" w:w="3373"/>
+            <w:tcBorders>
+              <w:top w:val="single" w:color="B8CBD4" w:sz="4"/>
+              <w:left w:val="single" w:color="B8CBD4" w:sz="4"/>
+              <w:bottom w:val="single" w:color="B8CBD4" w:sz="4"/>
+              <w:right w:val="single" w:color="B8CBD4" w:sz="4"/>
+            </w:tcBorders>
+            <w:shd w:fill="F2F5F7" w:color="auto" w:val="clear"/>
+            <w:tcMar>
+              <w:top w:type="dxa" w:w="60"/>
+              <w:left w:type="dxa" w:w="100"/>
+              <w:bottom w:type="dxa" w:w="60"/>
+              <w:right w:type="dxa" w:w="100"/>
+            </w:tcMar>
+          </w:tcPr>
+          <w:p>
+            <w:pPr>
+              <w:spacing w:after="0" w:line="260"/>
+            </w:pPr>
+            <w:r>
+              <w:rPr>
+                <w:rFonts w:ascii="Yu Gothic" w:cs="Yu Gothic" w:eastAsia="Yu Gothic" w:hAnsi="Yu Gothic"/>
+                <w:b/>
+                <w:bCs/>
+                <w:color w:val="000000"/>
+                <w:sz w:val="19"/>
+                <w:szCs w:val="19"/>
+              </w:rPr>
               <w:t xml:space="preserve">「既に受付済み」が誤って出る</w:t>
             </w:r>
           </w:p>
@@ -5419,6 +5163,45 @@
               <w:bottom w:val="single" w:color="B8CBD4" w:sz="4"/>
               <w:right w:val="single" w:color="B8CBD4" w:sz="4"/>
             </w:tcBorders>
+            <w:shd w:fill="F2F5F7" w:color="auto" w:val="clear"/>
+            <w:tcMar>
+              <w:top w:type="dxa" w:w="60"/>
+              <w:left w:type="dxa" w:w="100"/>
+              <w:bottom w:type="dxa" w:w="60"/>
+              <w:right w:type="dxa" w:w="100"/>
+            </w:tcMar>
+          </w:tcPr>
+          <w:p>
+            <w:pPr>
+              <w:spacing w:after="0" w:line="260"/>
+            </w:pPr>
+            <w:r>
+              <w:rPr>
+                <w:rFonts w:ascii="Yu Gothic" w:cs="Yu Gothic" w:eastAsia="Yu Gothic" w:hAnsi="Yu Gothic"/>
+                <w:b w:val="false"/>
+                <w:bCs w:val="false"/>
+                <w:color w:val="000000"/>
+                <w:sz w:val="19"/>
+                <w:szCs w:val="19"/>
+              </w:rPr>
+              <w:t xml:space="preserve">同姓同名が名簿にいる。確認のうえ「はい」で登録を続ける</w:t>
+            </w:r>
+          </w:p>
+        </w:tc>
+      </w:tr>
+      <w:tr>
+        <w:trPr>
+          <w:cantSplit/>
+        </w:trPr>
+        <w:tc>
+          <w:tcPr>
+            <w:tcW w:type="dxa" w:w="3373"/>
+            <w:tcBorders>
+              <w:top w:val="single" w:color="B8CBD4" w:sz="4"/>
+              <w:left w:val="single" w:color="B8CBD4" w:sz="4"/>
+              <w:bottom w:val="single" w:color="B8CBD4" w:sz="4"/>
+              <w:right w:val="single" w:color="B8CBD4" w:sz="4"/>
+            </w:tcBorders>
             <w:shd w:fill="FFFFFF" w:color="auto" w:val="clear"/>
             <w:tcMar>
               <w:top w:type="dxa" w:w="60"/>
@@ -5434,13 +5217,47 @@
             <w:r>
               <w:rPr>
                 <w:rFonts w:ascii="Yu Gothic" w:cs="Yu Gothic" w:eastAsia="Yu Gothic" w:hAnsi="Yu Gothic"/>
-                <w:b w:val="false"/>
-                <w:bCs w:val="false"/>
-                <w:color w:val="000000"/>
-                <w:sz w:val="19"/>
-                <w:szCs w:val="19"/>
-              </w:rPr>
-              <w:t xml:space="preserve">同姓同名が名簿にいる。「はい」で登録を続けるか、備考で区別する</w:t>
+                <w:b/>
+                <w:bCs/>
+                <w:color w:val="000000"/>
+                <w:sz w:val="19"/>
+                <w:szCs w:val="19"/>
+              </w:rPr>
+              <w:t xml:space="preserve">便潜血・オプションの欄を使いたい</w:t>
+            </w:r>
+          </w:p>
+        </w:tc>
+        <w:tc>
+          <w:tcPr>
+            <w:tcW w:type="dxa" w:w="6265"/>
+            <w:tcBorders>
+              <w:top w:val="single" w:color="B8CBD4" w:sz="4"/>
+              <w:left w:val="single" w:color="B8CBD4" w:sz="4"/>
+              <w:bottom w:val="single" w:color="B8CBD4" w:sz="4"/>
+              <w:right w:val="single" w:color="B8CBD4" w:sz="4"/>
+            </w:tcBorders>
+            <w:shd w:fill="FFFFFF" w:color="auto" w:val="clear"/>
+            <w:tcMar>
+              <w:top w:type="dxa" w:w="60"/>
+              <w:left w:type="dxa" w:w="100"/>
+              <w:bottom w:type="dxa" w:w="60"/>
+              <w:right w:type="dxa" w:w="100"/>
+            </w:tcMar>
+          </w:tcPr>
+          <w:p>
+            <w:pPr>
+              <w:spacing w:after="0" w:line="260"/>
+            </w:pPr>
+            <w:r>
+              <w:rPr>
+                <w:rFonts w:ascii="Yu Gothic" w:cs="Yu Gothic" w:eastAsia="Yu Gothic" w:hAnsi="Yu Gothic"/>
+                <w:b w:val="false"/>
+                <w:bCs w:val="false"/>
+                <w:color w:val="000000"/>
+                <w:sz w:val="19"/>
+                <w:szCs w:val="19"/>
+              </w:rPr>
+              <w:t xml:space="preserve">入力シートの19〜33行目が非表示になっている。行番号18と34の間を右クリック →「再表示」で出せる。行は削除しないこと（ボタンが動かなくなる）</w:t>
             </w:r>
           </w:p>
         </w:tc>
@@ -5930,6 +5747,24 @@
     </w:lvl>
   </w:abstractNum>
   <w:abstractNum w:abstractNumId="10" w15:restartNumberingAfterBreak="0">
+    <w:multiLevelType w:val="hybridMultilevel"/>
+    <w:lvl w:ilvl="0" w15:tentative="1">
+      <w:start w:val="1"/>
+      <w:numFmt w:val="decimal"/>
+      <w:lvlText w:val="%1."/>
+      <w:lvlJc w:val="left"/>
+      <w:pPr>
+        <w:ind w:left="567" w:hanging="340"/>
+      </w:pPr>
+      <w:rPr>
+        <w:rFonts w:ascii="Yu Gothic" w:cs="Yu Gothic" w:eastAsia="Yu Gothic" w:hAnsi="Yu Gothic"/>
+        <w:b/>
+        <w:bCs/>
+        <w:color w:val="0A7B6C"/>
+      </w:rPr>
+    </w:lvl>
+  </w:abstractNum>
+  <w:abstractNum w:abstractNumId="11" w15:restartNumberingAfterBreak="0">
     <w:multiLevelType w:val="hybridMultilevel"/>
     <w:lvl w:ilvl="0" w15:tentative="1">
       <w:start w:val="1"/>
@@ -6003,6 +5838,12 @@
   </w:num>
   <w:num w:numId="10">
     <w:abstractNumId w:val="10"/>
+    <w:lvlOverride w:ilvl="0">
+      <w:startOverride w:val="1"/>
+    </w:lvlOverride>
+  </w:num>
+  <w:num w:numId="11">
+    <w:abstractNumId w:val="11"/>
     <w:lvlOverride w:ilvl="0">
       <w:startOverride w:val="1"/>
     </w:lvlOverride>

</xml_diff>